<commit_message>
feat: add audio hyperlinks and music playback to docx and lyrics OS tab
</commit_message>
<xml_diff>
--- a/大巨蛋演繹段歌詞OS內容.docx
+++ b/大巨蛋演繹段歌詞OS內容.docx
@@ -79,6 +79,54 @@
         <w:t>】</w:t>
       </w:r>
       <w:proofErr w:type="gramEnd"/>
+      <w:r>
+        <w:t xml:space="preserve">  </w:t>
+      </w:r>
+      <w:hyperlink r:id="rId16">
+        <w:r>
+          <w:drawing>
+            <wp:inline xmlns:a="http://schemas.openxmlformats.org/drawingml/2006/main" xmlns:pic="http://schemas.openxmlformats.org/drawingml/2006/picture">
+              <wp:extent cx="164592" cy="164592"/>
+              <wp:docPr id="1" name="Picture 1"/>
+              <wp:cNvGraphicFramePr>
+                <a:graphicFrameLocks noChangeAspect="1"/>
+              </wp:cNvGraphicFramePr>
+              <a:graphic>
+                <a:graphicData uri="http://schemas.openxmlformats.org/drawingml/2006/picture">
+                  <pic:pic>
+                    <pic:nvPicPr>
+                      <pic:cNvPr id="0" name="audio_play_icon.png"/>
+                      <pic:cNvPicPr/>
+                    </pic:nvPicPr>
+                    <pic:blipFill>
+                      <a:blip r:embed="rId17"/>
+                      <a:stretch>
+                        <a:fillRect/>
+                      </a:stretch>
+                    </pic:blipFill>
+                    <pic:spPr>
+                      <a:xfrm>
+                        <a:off x="0" y="0"/>
+                        <a:ext cx="164592" cy="164592"/>
+                      </a:xfrm>
+                      <a:prstGeom prst="rect"/>
+                    </pic:spPr>
+                  </pic:pic>
+                </a:graphicData>
+              </a:graphic>
+            </wp:inline>
+          </w:drawing>
+        </w:r>
+        <w:r>
+          <w:rPr>
+            <w:color w:val="0D47A1"/>
+            <w:u w:val="single"/>
+            <w:b/>
+            <w:sz w:val="21"/>
+          </w:rPr>
+          <w:t> [點擊播放音檔]</w:t>
+        </w:r>
+      </w:hyperlink>
     </w:p>
     <w:p>
       <w:pPr>
@@ -603,6 +651,54 @@
         </w:rPr>
         <w:t>】</w:t>
       </w:r>
+      <w:r>
+        <w:t xml:space="preserve">  </w:t>
+      </w:r>
+      <w:hyperlink r:id="rId18">
+        <w:r>
+          <w:drawing>
+            <wp:inline xmlns:a="http://schemas.openxmlformats.org/drawingml/2006/main" xmlns:pic="http://schemas.openxmlformats.org/drawingml/2006/picture">
+              <wp:extent cx="164592" cy="164592"/>
+              <wp:docPr id="2" name="Picture 2"/>
+              <wp:cNvGraphicFramePr>
+                <a:graphicFrameLocks noChangeAspect="1"/>
+              </wp:cNvGraphicFramePr>
+              <a:graphic>
+                <a:graphicData uri="http://schemas.openxmlformats.org/drawingml/2006/picture">
+                  <pic:pic>
+                    <pic:nvPicPr>
+                      <pic:cNvPr id="0" name="audio_play_icon.png"/>
+                      <pic:cNvPicPr/>
+                    </pic:nvPicPr>
+                    <pic:blipFill>
+                      <a:blip r:embed="rId17"/>
+                      <a:stretch>
+                        <a:fillRect/>
+                      </a:stretch>
+                    </pic:blipFill>
+                    <pic:spPr>
+                      <a:xfrm>
+                        <a:off x="0" y="0"/>
+                        <a:ext cx="164592" cy="164592"/>
+                      </a:xfrm>
+                      <a:prstGeom prst="rect"/>
+                    </pic:spPr>
+                  </pic:pic>
+                </a:graphicData>
+              </a:graphic>
+            </wp:inline>
+          </w:drawing>
+        </w:r>
+        <w:r>
+          <w:rPr>
+            <w:color w:val="0D47A1"/>
+            <w:u w:val="single"/>
+            <w:b/>
+            <w:sz w:val="21"/>
+          </w:rPr>
+          <w:t> [點擊播放音檔]</w:t>
+        </w:r>
+      </w:hyperlink>
     </w:p>
     <w:p>
       <w:pPr>
@@ -1422,6 +1518,54 @@
         <w:t>】</w:t>
       </w:r>
       <w:proofErr w:type="gramEnd"/>
+      <w:r>
+        <w:t xml:space="preserve">  </w:t>
+      </w:r>
+      <w:hyperlink r:id="rId19">
+        <w:r>
+          <w:drawing>
+            <wp:inline xmlns:a="http://schemas.openxmlformats.org/drawingml/2006/main" xmlns:pic="http://schemas.openxmlformats.org/drawingml/2006/picture">
+              <wp:extent cx="164592" cy="164592"/>
+              <wp:docPr id="3" name="Picture 3"/>
+              <wp:cNvGraphicFramePr>
+                <a:graphicFrameLocks noChangeAspect="1"/>
+              </wp:cNvGraphicFramePr>
+              <a:graphic>
+                <a:graphicData uri="http://schemas.openxmlformats.org/drawingml/2006/picture">
+                  <pic:pic>
+                    <pic:nvPicPr>
+                      <pic:cNvPr id="0" name="audio_play_icon.png"/>
+                      <pic:cNvPicPr/>
+                    </pic:nvPicPr>
+                    <pic:blipFill>
+                      <a:blip r:embed="rId17"/>
+                      <a:stretch>
+                        <a:fillRect/>
+                      </a:stretch>
+                    </pic:blipFill>
+                    <pic:spPr>
+                      <a:xfrm>
+                        <a:off x="0" y="0"/>
+                        <a:ext cx="164592" cy="164592"/>
+                      </a:xfrm>
+                      <a:prstGeom prst="rect"/>
+                    </pic:spPr>
+                  </pic:pic>
+                </a:graphicData>
+              </a:graphic>
+            </wp:inline>
+          </w:drawing>
+        </w:r>
+        <w:r>
+          <w:rPr>
+            <w:color w:val="0D47A1"/>
+            <w:u w:val="single"/>
+            <w:b/>
+            <w:sz w:val="21"/>
+          </w:rPr>
+          <w:t> [點擊播放音檔]</w:t>
+        </w:r>
+      </w:hyperlink>
     </w:p>
     <w:p>
       <w:pPr>
@@ -1766,6 +1910,54 @@
         <w:t>】</w:t>
       </w:r>
       <w:proofErr w:type="gramEnd"/>
+      <w:r>
+        <w:t xml:space="preserve">  </w:t>
+      </w:r>
+      <w:hyperlink r:id="rId20">
+        <w:r>
+          <w:drawing>
+            <wp:inline xmlns:a="http://schemas.openxmlformats.org/drawingml/2006/main" xmlns:pic="http://schemas.openxmlformats.org/drawingml/2006/picture">
+              <wp:extent cx="164592" cy="164592"/>
+              <wp:docPr id="4" name="Picture 4"/>
+              <wp:cNvGraphicFramePr>
+                <a:graphicFrameLocks noChangeAspect="1"/>
+              </wp:cNvGraphicFramePr>
+              <a:graphic>
+                <a:graphicData uri="http://schemas.openxmlformats.org/drawingml/2006/picture">
+                  <pic:pic>
+                    <pic:nvPicPr>
+                      <pic:cNvPr id="0" name="audio_play_icon.png"/>
+                      <pic:cNvPicPr/>
+                    </pic:nvPicPr>
+                    <pic:blipFill>
+                      <a:blip r:embed="rId17"/>
+                      <a:stretch>
+                        <a:fillRect/>
+                      </a:stretch>
+                    </pic:blipFill>
+                    <pic:spPr>
+                      <a:xfrm>
+                        <a:off x="0" y="0"/>
+                        <a:ext cx="164592" cy="164592"/>
+                      </a:xfrm>
+                      <a:prstGeom prst="rect"/>
+                    </pic:spPr>
+                  </pic:pic>
+                </a:graphicData>
+              </a:graphic>
+            </wp:inline>
+          </w:drawing>
+        </w:r>
+        <w:r>
+          <w:rPr>
+            <w:color w:val="0D47A1"/>
+            <w:u w:val="single"/>
+            <w:b/>
+            <w:sz w:val="21"/>
+          </w:rPr>
+          <w:t> [點擊播放音檔]</w:t>
+        </w:r>
+      </w:hyperlink>
     </w:p>
     <w:p>
       <w:pPr>
@@ -2073,6 +2265,54 @@
         <w:t>】</w:t>
       </w:r>
       <w:proofErr w:type="gramEnd"/>
+      <w:r>
+        <w:t xml:space="preserve">  </w:t>
+      </w:r>
+      <w:hyperlink r:id="rId21">
+        <w:r>
+          <w:drawing>
+            <wp:inline xmlns:a="http://schemas.openxmlformats.org/drawingml/2006/main" xmlns:pic="http://schemas.openxmlformats.org/drawingml/2006/picture">
+              <wp:extent cx="164592" cy="164592"/>
+              <wp:docPr id="5" name="Picture 5"/>
+              <wp:cNvGraphicFramePr>
+                <a:graphicFrameLocks noChangeAspect="1"/>
+              </wp:cNvGraphicFramePr>
+              <a:graphic>
+                <a:graphicData uri="http://schemas.openxmlformats.org/drawingml/2006/picture">
+                  <pic:pic>
+                    <pic:nvPicPr>
+                      <pic:cNvPr id="0" name="audio_play_icon.png"/>
+                      <pic:cNvPicPr/>
+                    </pic:nvPicPr>
+                    <pic:blipFill>
+                      <a:blip r:embed="rId17"/>
+                      <a:stretch>
+                        <a:fillRect/>
+                      </a:stretch>
+                    </pic:blipFill>
+                    <pic:spPr>
+                      <a:xfrm>
+                        <a:off x="0" y="0"/>
+                        <a:ext cx="164592" cy="164592"/>
+                      </a:xfrm>
+                      <a:prstGeom prst="rect"/>
+                    </pic:spPr>
+                  </pic:pic>
+                </a:graphicData>
+              </a:graphic>
+            </wp:inline>
+          </w:drawing>
+        </w:r>
+        <w:r>
+          <w:rPr>
+            <w:color w:val="0D47A1"/>
+            <w:u w:val="single"/>
+            <w:b/>
+            <w:sz w:val="21"/>
+          </w:rPr>
+          <w:t> [點擊播放音檔]</w:t>
+        </w:r>
+      </w:hyperlink>
     </w:p>
     <w:p>
       <w:pPr>
@@ -2422,6 +2662,54 @@
         <w:t>】</w:t>
       </w:r>
       <w:proofErr w:type="gramEnd"/>
+      <w:r>
+        <w:t xml:space="preserve">  </w:t>
+      </w:r>
+      <w:hyperlink r:id="rId22">
+        <w:r>
+          <w:drawing>
+            <wp:inline xmlns:a="http://schemas.openxmlformats.org/drawingml/2006/main" xmlns:pic="http://schemas.openxmlformats.org/drawingml/2006/picture">
+              <wp:extent cx="164592" cy="164592"/>
+              <wp:docPr id="6" name="Picture 6"/>
+              <wp:cNvGraphicFramePr>
+                <a:graphicFrameLocks noChangeAspect="1"/>
+              </wp:cNvGraphicFramePr>
+              <a:graphic>
+                <a:graphicData uri="http://schemas.openxmlformats.org/drawingml/2006/picture">
+                  <pic:pic>
+                    <pic:nvPicPr>
+                      <pic:cNvPr id="0" name="audio_play_icon.png"/>
+                      <pic:cNvPicPr/>
+                    </pic:nvPicPr>
+                    <pic:blipFill>
+                      <a:blip r:embed="rId17"/>
+                      <a:stretch>
+                        <a:fillRect/>
+                      </a:stretch>
+                    </pic:blipFill>
+                    <pic:spPr>
+                      <a:xfrm>
+                        <a:off x="0" y="0"/>
+                        <a:ext cx="164592" cy="164592"/>
+                      </a:xfrm>
+                      <a:prstGeom prst="rect"/>
+                    </pic:spPr>
+                  </pic:pic>
+                </a:graphicData>
+              </a:graphic>
+            </wp:inline>
+          </w:drawing>
+        </w:r>
+        <w:r>
+          <w:rPr>
+            <w:color w:val="0D47A1"/>
+            <w:u w:val="single"/>
+            <w:b/>
+            <w:sz w:val="21"/>
+          </w:rPr>
+          <w:t> [點擊播放音檔]</w:t>
+        </w:r>
+      </w:hyperlink>
     </w:p>
     <w:p>
       <w:pPr>
@@ -3369,6 +3657,54 @@
         <w:t>】</w:t>
       </w:r>
       <w:proofErr w:type="gramEnd"/>
+      <w:r>
+        <w:t xml:space="preserve">  </w:t>
+      </w:r>
+      <w:hyperlink r:id="rId23">
+        <w:r>
+          <w:drawing>
+            <wp:inline xmlns:a="http://schemas.openxmlformats.org/drawingml/2006/main" xmlns:pic="http://schemas.openxmlformats.org/drawingml/2006/picture">
+              <wp:extent cx="164592" cy="164592"/>
+              <wp:docPr id="7" name="Picture 7"/>
+              <wp:cNvGraphicFramePr>
+                <a:graphicFrameLocks noChangeAspect="1"/>
+              </wp:cNvGraphicFramePr>
+              <a:graphic>
+                <a:graphicData uri="http://schemas.openxmlformats.org/drawingml/2006/picture">
+                  <pic:pic>
+                    <pic:nvPicPr>
+                      <pic:cNvPr id="0" name="audio_play_icon.png"/>
+                      <pic:cNvPicPr/>
+                    </pic:nvPicPr>
+                    <pic:blipFill>
+                      <a:blip r:embed="rId17"/>
+                      <a:stretch>
+                        <a:fillRect/>
+                      </a:stretch>
+                    </pic:blipFill>
+                    <pic:spPr>
+                      <a:xfrm>
+                        <a:off x="0" y="0"/>
+                        <a:ext cx="164592" cy="164592"/>
+                      </a:xfrm>
+                      <a:prstGeom prst="rect"/>
+                    </pic:spPr>
+                  </pic:pic>
+                </a:graphicData>
+              </a:graphic>
+            </wp:inline>
+          </w:drawing>
+        </w:r>
+        <w:r>
+          <w:rPr>
+            <w:color w:val="0D47A1"/>
+            <w:u w:val="single"/>
+            <w:b/>
+            <w:sz w:val="21"/>
+          </w:rPr>
+          <w:t> [點擊播放音檔]</w:t>
+        </w:r>
+      </w:hyperlink>
     </w:p>
     <w:p>
       <w:pPr>
@@ -3856,6 +4192,54 @@
         </w:rPr>
         <w:t>】</w:t>
       </w:r>
+      <w:r>
+        <w:t xml:space="preserve">  </w:t>
+      </w:r>
+      <w:hyperlink r:id="rId23">
+        <w:r>
+          <w:drawing>
+            <wp:inline xmlns:a="http://schemas.openxmlformats.org/drawingml/2006/main" xmlns:pic="http://schemas.openxmlformats.org/drawingml/2006/picture">
+              <wp:extent cx="164592" cy="164592"/>
+              <wp:docPr id="8" name="Picture 8"/>
+              <wp:cNvGraphicFramePr>
+                <a:graphicFrameLocks noChangeAspect="1"/>
+              </wp:cNvGraphicFramePr>
+              <a:graphic>
+                <a:graphicData uri="http://schemas.openxmlformats.org/drawingml/2006/picture">
+                  <pic:pic>
+                    <pic:nvPicPr>
+                      <pic:cNvPr id="0" name="audio_play_icon.png"/>
+                      <pic:cNvPicPr/>
+                    </pic:nvPicPr>
+                    <pic:blipFill>
+                      <a:blip r:embed="rId17"/>
+                      <a:stretch>
+                        <a:fillRect/>
+                      </a:stretch>
+                    </pic:blipFill>
+                    <pic:spPr>
+                      <a:xfrm>
+                        <a:off x="0" y="0"/>
+                        <a:ext cx="164592" cy="164592"/>
+                      </a:xfrm>
+                      <a:prstGeom prst="rect"/>
+                    </pic:spPr>
+                  </pic:pic>
+                </a:graphicData>
+              </a:graphic>
+            </wp:inline>
+          </w:drawing>
+        </w:r>
+        <w:r>
+          <w:rPr>
+            <w:color w:val="0D47A1"/>
+            <w:u w:val="single"/>
+            <w:b/>
+            <w:sz w:val="21"/>
+          </w:rPr>
+          <w:t> [點擊播放音檔]</w:t>
+        </w:r>
+      </w:hyperlink>
     </w:p>
     <w:p>
       <w:pPr>
@@ -4237,6 +4621,54 @@
         <w:t>】</w:t>
       </w:r>
       <w:proofErr w:type="gramEnd"/>
+      <w:r>
+        <w:t xml:space="preserve">  </w:t>
+      </w:r>
+      <w:hyperlink r:id="rId24">
+        <w:r>
+          <w:drawing>
+            <wp:inline xmlns:a="http://schemas.openxmlformats.org/drawingml/2006/main" xmlns:pic="http://schemas.openxmlformats.org/drawingml/2006/picture">
+              <wp:extent cx="164592" cy="164592"/>
+              <wp:docPr id="9" name="Picture 9"/>
+              <wp:cNvGraphicFramePr>
+                <a:graphicFrameLocks noChangeAspect="1"/>
+              </wp:cNvGraphicFramePr>
+              <a:graphic>
+                <a:graphicData uri="http://schemas.openxmlformats.org/drawingml/2006/picture">
+                  <pic:pic>
+                    <pic:nvPicPr>
+                      <pic:cNvPr id="0" name="audio_play_icon.png"/>
+                      <pic:cNvPicPr/>
+                    </pic:nvPicPr>
+                    <pic:blipFill>
+                      <a:blip r:embed="rId17"/>
+                      <a:stretch>
+                        <a:fillRect/>
+                      </a:stretch>
+                    </pic:blipFill>
+                    <pic:spPr>
+                      <a:xfrm>
+                        <a:off x="0" y="0"/>
+                        <a:ext cx="164592" cy="164592"/>
+                      </a:xfrm>
+                      <a:prstGeom prst="rect"/>
+                    </pic:spPr>
+                  </pic:pic>
+                </a:graphicData>
+              </a:graphic>
+            </wp:inline>
+          </w:drawing>
+        </w:r>
+        <w:r>
+          <w:rPr>
+            <w:color w:val="0D47A1"/>
+            <w:u w:val="single"/>
+            <w:b/>
+            <w:sz w:val="21"/>
+          </w:rPr>
+          <w:t> [點擊播放音檔]</w:t>
+        </w:r>
+      </w:hyperlink>
     </w:p>
     <w:p>
       <w:pPr>
@@ -4882,6 +5314,54 @@
         </w:rPr>
         <w:t>】</w:t>
       </w:r>
+      <w:r>
+        <w:t xml:space="preserve">  </w:t>
+      </w:r>
+      <w:hyperlink r:id="rId25">
+        <w:r>
+          <w:drawing>
+            <wp:inline xmlns:a="http://schemas.openxmlformats.org/drawingml/2006/main" xmlns:pic="http://schemas.openxmlformats.org/drawingml/2006/picture">
+              <wp:extent cx="164592" cy="164592"/>
+              <wp:docPr id="10" name="Picture 10"/>
+              <wp:cNvGraphicFramePr>
+                <a:graphicFrameLocks noChangeAspect="1"/>
+              </wp:cNvGraphicFramePr>
+              <a:graphic>
+                <a:graphicData uri="http://schemas.openxmlformats.org/drawingml/2006/picture">
+                  <pic:pic>
+                    <pic:nvPicPr>
+                      <pic:cNvPr id="0" name="audio_play_icon.png"/>
+                      <pic:cNvPicPr/>
+                    </pic:nvPicPr>
+                    <pic:blipFill>
+                      <a:blip r:embed="rId17"/>
+                      <a:stretch>
+                        <a:fillRect/>
+                      </a:stretch>
+                    </pic:blipFill>
+                    <pic:spPr>
+                      <a:xfrm>
+                        <a:off x="0" y="0"/>
+                        <a:ext cx="164592" cy="164592"/>
+                      </a:xfrm>
+                      <a:prstGeom prst="rect"/>
+                    </pic:spPr>
+                  </pic:pic>
+                </a:graphicData>
+              </a:graphic>
+            </wp:inline>
+          </w:drawing>
+        </w:r>
+        <w:r>
+          <w:rPr>
+            <w:color w:val="0D47A1"/>
+            <w:u w:val="single"/>
+            <w:b/>
+            <w:sz w:val="21"/>
+          </w:rPr>
+          <w:t> [點擊播放音檔]</w:t>
+        </w:r>
+      </w:hyperlink>
     </w:p>
     <w:p>
       <w:pPr>
@@ -5700,6 +6180,54 @@
         </w:rPr>
         <w:t>】</w:t>
       </w:r>
+      <w:r>
+        <w:t xml:space="preserve">  </w:t>
+      </w:r>
+      <w:hyperlink r:id="rId26">
+        <w:r>
+          <w:drawing>
+            <wp:inline xmlns:a="http://schemas.openxmlformats.org/drawingml/2006/main" xmlns:pic="http://schemas.openxmlformats.org/drawingml/2006/picture">
+              <wp:extent cx="164592" cy="164592"/>
+              <wp:docPr id="11" name="Picture 11"/>
+              <wp:cNvGraphicFramePr>
+                <a:graphicFrameLocks noChangeAspect="1"/>
+              </wp:cNvGraphicFramePr>
+              <a:graphic>
+                <a:graphicData uri="http://schemas.openxmlformats.org/drawingml/2006/picture">
+                  <pic:pic>
+                    <pic:nvPicPr>
+                      <pic:cNvPr id="0" name="audio_play_icon.png"/>
+                      <pic:cNvPicPr/>
+                    </pic:nvPicPr>
+                    <pic:blipFill>
+                      <a:blip r:embed="rId17"/>
+                      <a:stretch>
+                        <a:fillRect/>
+                      </a:stretch>
+                    </pic:blipFill>
+                    <pic:spPr>
+                      <a:xfrm>
+                        <a:off x="0" y="0"/>
+                        <a:ext cx="164592" cy="164592"/>
+                      </a:xfrm>
+                      <a:prstGeom prst="rect"/>
+                    </pic:spPr>
+                  </pic:pic>
+                </a:graphicData>
+              </a:graphic>
+            </wp:inline>
+          </w:drawing>
+        </w:r>
+        <w:r>
+          <w:rPr>
+            <w:color w:val="0D47A1"/>
+            <w:u w:val="single"/>
+            <w:b/>
+            <w:sz w:val="21"/>
+          </w:rPr>
+          <w:t> [點擊播放音檔]</w:t>
+        </w:r>
+      </w:hyperlink>
     </w:p>
     <w:p>
       <w:pPr>
@@ -6066,6 +6594,54 @@
         </w:rPr>
         <w:t>】</w:t>
       </w:r>
+      <w:r>
+        <w:t xml:space="preserve">  </w:t>
+      </w:r>
+      <w:hyperlink r:id="rId27">
+        <w:r>
+          <w:drawing>
+            <wp:inline xmlns:a="http://schemas.openxmlformats.org/drawingml/2006/main" xmlns:pic="http://schemas.openxmlformats.org/drawingml/2006/picture">
+              <wp:extent cx="164592" cy="164592"/>
+              <wp:docPr id="12" name="Picture 12"/>
+              <wp:cNvGraphicFramePr>
+                <a:graphicFrameLocks noChangeAspect="1"/>
+              </wp:cNvGraphicFramePr>
+              <a:graphic>
+                <a:graphicData uri="http://schemas.openxmlformats.org/drawingml/2006/picture">
+                  <pic:pic>
+                    <pic:nvPicPr>
+                      <pic:cNvPr id="0" name="audio_play_icon.png"/>
+                      <pic:cNvPicPr/>
+                    </pic:nvPicPr>
+                    <pic:blipFill>
+                      <a:blip r:embed="rId17"/>
+                      <a:stretch>
+                        <a:fillRect/>
+                      </a:stretch>
+                    </pic:blipFill>
+                    <pic:spPr>
+                      <a:xfrm>
+                        <a:off x="0" y="0"/>
+                        <a:ext cx="164592" cy="164592"/>
+                      </a:xfrm>
+                      <a:prstGeom prst="rect"/>
+                    </pic:spPr>
+                  </pic:pic>
+                </a:graphicData>
+              </a:graphic>
+            </wp:inline>
+          </w:drawing>
+        </w:r>
+        <w:r>
+          <w:rPr>
+            <w:color w:val="0D47A1"/>
+            <w:u w:val="single"/>
+            <w:b/>
+            <w:sz w:val="21"/>
+          </w:rPr>
+          <w:t> [點擊播放音檔]</w:t>
+        </w:r>
+      </w:hyperlink>
     </w:p>
     <w:p>
       <w:pPr>
@@ -7495,6 +8071,54 @@
         <w:t>】</w:t>
       </w:r>
       <w:proofErr w:type="gramEnd"/>
+      <w:r>
+        <w:t xml:space="preserve">  </w:t>
+      </w:r>
+      <w:hyperlink r:id="rId28">
+        <w:r>
+          <w:drawing>
+            <wp:inline xmlns:a="http://schemas.openxmlformats.org/drawingml/2006/main" xmlns:pic="http://schemas.openxmlformats.org/drawingml/2006/picture">
+              <wp:extent cx="164592" cy="164592"/>
+              <wp:docPr id="13" name="Picture 13"/>
+              <wp:cNvGraphicFramePr>
+                <a:graphicFrameLocks noChangeAspect="1"/>
+              </wp:cNvGraphicFramePr>
+              <a:graphic>
+                <a:graphicData uri="http://schemas.openxmlformats.org/drawingml/2006/picture">
+                  <pic:pic>
+                    <pic:nvPicPr>
+                      <pic:cNvPr id="0" name="audio_play_icon.png"/>
+                      <pic:cNvPicPr/>
+                    </pic:nvPicPr>
+                    <pic:blipFill>
+                      <a:blip r:embed="rId17"/>
+                      <a:stretch>
+                        <a:fillRect/>
+                      </a:stretch>
+                    </pic:blipFill>
+                    <pic:spPr>
+                      <a:xfrm>
+                        <a:off x="0" y="0"/>
+                        <a:ext cx="164592" cy="164592"/>
+                      </a:xfrm>
+                      <a:prstGeom prst="rect"/>
+                    </pic:spPr>
+                  </pic:pic>
+                </a:graphicData>
+              </a:graphic>
+            </wp:inline>
+          </w:drawing>
+        </w:r>
+        <w:r>
+          <w:rPr>
+            <w:color w:val="0D47A1"/>
+            <w:u w:val="single"/>
+            <w:b/>
+            <w:sz w:val="21"/>
+          </w:rPr>
+          <w:t> [點擊播放音檔]</w:t>
+        </w:r>
+      </w:hyperlink>
     </w:p>
     <w:p>
       <w:pPr>
@@ -8749,6 +9373,54 @@
         <w:t>】</w:t>
       </w:r>
       <w:proofErr w:type="gramEnd"/>
+      <w:r>
+        <w:t xml:space="preserve">  </w:t>
+      </w:r>
+      <w:hyperlink r:id="rId29">
+        <w:r>
+          <w:drawing>
+            <wp:inline xmlns:a="http://schemas.openxmlformats.org/drawingml/2006/main" xmlns:pic="http://schemas.openxmlformats.org/drawingml/2006/picture">
+              <wp:extent cx="164592" cy="164592"/>
+              <wp:docPr id="14" name="Picture 14"/>
+              <wp:cNvGraphicFramePr>
+                <a:graphicFrameLocks noChangeAspect="1"/>
+              </wp:cNvGraphicFramePr>
+              <a:graphic>
+                <a:graphicData uri="http://schemas.openxmlformats.org/drawingml/2006/picture">
+                  <pic:pic>
+                    <pic:nvPicPr>
+                      <pic:cNvPr id="0" name="audio_play_icon.png"/>
+                      <pic:cNvPicPr/>
+                    </pic:nvPicPr>
+                    <pic:blipFill>
+                      <a:blip r:embed="rId17"/>
+                      <a:stretch>
+                        <a:fillRect/>
+                      </a:stretch>
+                    </pic:blipFill>
+                    <pic:spPr>
+                      <a:xfrm>
+                        <a:off x="0" y="0"/>
+                        <a:ext cx="164592" cy="164592"/>
+                      </a:xfrm>
+                      <a:prstGeom prst="rect"/>
+                    </pic:spPr>
+                  </pic:pic>
+                </a:graphicData>
+              </a:graphic>
+            </wp:inline>
+          </w:drawing>
+        </w:r>
+        <w:r>
+          <w:rPr>
+            <w:color w:val="0D47A1"/>
+            <w:u w:val="single"/>
+            <w:b/>
+            <w:sz w:val="21"/>
+          </w:rPr>
+          <w:t> [點擊播放音檔]</w:t>
+        </w:r>
+      </w:hyperlink>
     </w:p>
     <w:p>
       <w:pPr>
@@ -8854,6 +9526,54 @@
         </w:rPr>
         <w:t>】</w:t>
       </w:r>
+      <w:r>
+        <w:t xml:space="preserve">  </w:t>
+      </w:r>
+      <w:hyperlink r:id="rId30">
+        <w:r>
+          <w:drawing>
+            <wp:inline xmlns:a="http://schemas.openxmlformats.org/drawingml/2006/main" xmlns:pic="http://schemas.openxmlformats.org/drawingml/2006/picture">
+              <wp:extent cx="164592" cy="164592"/>
+              <wp:docPr id="15" name="Picture 15"/>
+              <wp:cNvGraphicFramePr>
+                <a:graphicFrameLocks noChangeAspect="1"/>
+              </wp:cNvGraphicFramePr>
+              <a:graphic>
+                <a:graphicData uri="http://schemas.openxmlformats.org/drawingml/2006/picture">
+                  <pic:pic>
+                    <pic:nvPicPr>
+                      <pic:cNvPr id="0" name="audio_play_icon.png"/>
+                      <pic:cNvPicPr/>
+                    </pic:nvPicPr>
+                    <pic:blipFill>
+                      <a:blip r:embed="rId17"/>
+                      <a:stretch>
+                        <a:fillRect/>
+                      </a:stretch>
+                    </pic:blipFill>
+                    <pic:spPr>
+                      <a:xfrm>
+                        <a:off x="0" y="0"/>
+                        <a:ext cx="164592" cy="164592"/>
+                      </a:xfrm>
+                      <a:prstGeom prst="rect"/>
+                    </pic:spPr>
+                  </pic:pic>
+                </a:graphicData>
+              </a:graphic>
+            </wp:inline>
+          </w:drawing>
+        </w:r>
+        <w:r>
+          <w:rPr>
+            <w:color w:val="0D47A1"/>
+            <w:u w:val="single"/>
+            <w:b/>
+            <w:sz w:val="21"/>
+          </w:rPr>
+          <w:t> [點擊播放音檔]</w:t>
+        </w:r>
+      </w:hyperlink>
     </w:p>
     <w:p>
       <w:pPr>
@@ -10172,6 +10892,54 @@
         <w:t>】</w:t>
       </w:r>
       <w:proofErr w:type="gramEnd"/>
+      <w:r>
+        <w:t xml:space="preserve">  </w:t>
+      </w:r>
+      <w:hyperlink r:id="rId31">
+        <w:r>
+          <w:drawing>
+            <wp:inline xmlns:a="http://schemas.openxmlformats.org/drawingml/2006/main" xmlns:pic="http://schemas.openxmlformats.org/drawingml/2006/picture">
+              <wp:extent cx="164592" cy="164592"/>
+              <wp:docPr id="16" name="Picture 16"/>
+              <wp:cNvGraphicFramePr>
+                <a:graphicFrameLocks noChangeAspect="1"/>
+              </wp:cNvGraphicFramePr>
+              <a:graphic>
+                <a:graphicData uri="http://schemas.openxmlformats.org/drawingml/2006/picture">
+                  <pic:pic>
+                    <pic:nvPicPr>
+                      <pic:cNvPr id="0" name="audio_play_icon.png"/>
+                      <pic:cNvPicPr/>
+                    </pic:nvPicPr>
+                    <pic:blipFill>
+                      <a:blip r:embed="rId17"/>
+                      <a:stretch>
+                        <a:fillRect/>
+                      </a:stretch>
+                    </pic:blipFill>
+                    <pic:spPr>
+                      <a:xfrm>
+                        <a:off x="0" y="0"/>
+                        <a:ext cx="164592" cy="164592"/>
+                      </a:xfrm>
+                      <a:prstGeom prst="rect"/>
+                    </pic:spPr>
+                  </pic:pic>
+                </a:graphicData>
+              </a:graphic>
+            </wp:inline>
+          </w:drawing>
+        </w:r>
+        <w:r>
+          <w:rPr>
+            <w:color w:val="0D47A1"/>
+            <w:u w:val="single"/>
+            <w:b/>
+            <w:sz w:val="21"/>
+          </w:rPr>
+          <w:t> [點擊播放音檔]</w:t>
+        </w:r>
+      </w:hyperlink>
     </w:p>
     <w:p>
       <w:pPr>
@@ -10771,6 +11539,54 @@
         <w:t>】</w:t>
       </w:r>
       <w:proofErr w:type="gramEnd"/>
+      <w:r>
+        <w:t xml:space="preserve">  </w:t>
+      </w:r>
+      <w:hyperlink r:id="rId31">
+        <w:r>
+          <w:drawing>
+            <wp:inline xmlns:a="http://schemas.openxmlformats.org/drawingml/2006/main" xmlns:pic="http://schemas.openxmlformats.org/drawingml/2006/picture">
+              <wp:extent cx="164592" cy="164592"/>
+              <wp:docPr id="17" name="Picture 17"/>
+              <wp:cNvGraphicFramePr>
+                <a:graphicFrameLocks noChangeAspect="1"/>
+              </wp:cNvGraphicFramePr>
+              <a:graphic>
+                <a:graphicData uri="http://schemas.openxmlformats.org/drawingml/2006/picture">
+                  <pic:pic>
+                    <pic:nvPicPr>
+                      <pic:cNvPr id="0" name="audio_play_icon.png"/>
+                      <pic:cNvPicPr/>
+                    </pic:nvPicPr>
+                    <pic:blipFill>
+                      <a:blip r:embed="rId17"/>
+                      <a:stretch>
+                        <a:fillRect/>
+                      </a:stretch>
+                    </pic:blipFill>
+                    <pic:spPr>
+                      <a:xfrm>
+                        <a:off x="0" y="0"/>
+                        <a:ext cx="164592" cy="164592"/>
+                      </a:xfrm>
+                      <a:prstGeom prst="rect"/>
+                    </pic:spPr>
+                  </pic:pic>
+                </a:graphicData>
+              </a:graphic>
+            </wp:inline>
+          </w:drawing>
+        </w:r>
+        <w:r>
+          <w:rPr>
+            <w:color w:val="0D47A1"/>
+            <w:u w:val="single"/>
+            <w:b/>
+            <w:sz w:val="21"/>
+          </w:rPr>
+          <w:t> [點擊播放音檔]</w:t>
+        </w:r>
+      </w:hyperlink>
     </w:p>
     <w:p>
       <w:pPr>
@@ -11436,6 +12252,54 @@
         <w:t>】</w:t>
       </w:r>
       <w:proofErr w:type="gramEnd"/>
+      <w:r>
+        <w:t xml:space="preserve">  </w:t>
+      </w:r>
+      <w:hyperlink r:id="rId32">
+        <w:r>
+          <w:drawing>
+            <wp:inline xmlns:a="http://schemas.openxmlformats.org/drawingml/2006/main" xmlns:pic="http://schemas.openxmlformats.org/drawingml/2006/picture">
+              <wp:extent cx="164592" cy="164592"/>
+              <wp:docPr id="18" name="Picture 18"/>
+              <wp:cNvGraphicFramePr>
+                <a:graphicFrameLocks noChangeAspect="1"/>
+              </wp:cNvGraphicFramePr>
+              <a:graphic>
+                <a:graphicData uri="http://schemas.openxmlformats.org/drawingml/2006/picture">
+                  <pic:pic>
+                    <pic:nvPicPr>
+                      <pic:cNvPr id="0" name="audio_play_icon.png"/>
+                      <pic:cNvPicPr/>
+                    </pic:nvPicPr>
+                    <pic:blipFill>
+                      <a:blip r:embed="rId17"/>
+                      <a:stretch>
+                        <a:fillRect/>
+                      </a:stretch>
+                    </pic:blipFill>
+                    <pic:spPr>
+                      <a:xfrm>
+                        <a:off x="0" y="0"/>
+                        <a:ext cx="164592" cy="164592"/>
+                      </a:xfrm>
+                      <a:prstGeom prst="rect"/>
+                    </pic:spPr>
+                  </pic:pic>
+                </a:graphicData>
+              </a:graphic>
+            </wp:inline>
+          </w:drawing>
+        </w:r>
+        <w:r>
+          <w:rPr>
+            <w:color w:val="0D47A1"/>
+            <w:u w:val="single"/>
+            <w:b/>
+            <w:sz w:val="21"/>
+          </w:rPr>
+          <w:t> [點擊播放音檔]</w:t>
+        </w:r>
+      </w:hyperlink>
     </w:p>
     <w:p>
       <w:pPr>
@@ -12097,6 +12961,54 @@
         </w:rPr>
         <w:t>】</w:t>
       </w:r>
+      <w:r>
+        <w:t xml:space="preserve">  </w:t>
+      </w:r>
+      <w:hyperlink r:id="rId33">
+        <w:r>
+          <w:drawing>
+            <wp:inline xmlns:a="http://schemas.openxmlformats.org/drawingml/2006/main" xmlns:pic="http://schemas.openxmlformats.org/drawingml/2006/picture">
+              <wp:extent cx="164592" cy="164592"/>
+              <wp:docPr id="19" name="Picture 19"/>
+              <wp:cNvGraphicFramePr>
+                <a:graphicFrameLocks noChangeAspect="1"/>
+              </wp:cNvGraphicFramePr>
+              <a:graphic>
+                <a:graphicData uri="http://schemas.openxmlformats.org/drawingml/2006/picture">
+                  <pic:pic>
+                    <pic:nvPicPr>
+                      <pic:cNvPr id="0" name="audio_play_icon.png"/>
+                      <pic:cNvPicPr/>
+                    </pic:nvPicPr>
+                    <pic:blipFill>
+                      <a:blip r:embed="rId17"/>
+                      <a:stretch>
+                        <a:fillRect/>
+                      </a:stretch>
+                    </pic:blipFill>
+                    <pic:spPr>
+                      <a:xfrm>
+                        <a:off x="0" y="0"/>
+                        <a:ext cx="164592" cy="164592"/>
+                      </a:xfrm>
+                      <a:prstGeom prst="rect"/>
+                    </pic:spPr>
+                  </pic:pic>
+                </a:graphicData>
+              </a:graphic>
+            </wp:inline>
+          </w:drawing>
+        </w:r>
+        <w:r>
+          <w:rPr>
+            <w:color w:val="0D47A1"/>
+            <w:u w:val="single"/>
+            <w:b/>
+            <w:sz w:val="21"/>
+          </w:rPr>
+          <w:t> [點擊播放音檔]</w:t>
+        </w:r>
+      </w:hyperlink>
     </w:p>
     <w:p>
       <w:pPr>
@@ -12683,6 +13595,54 @@
         <w:t>】</w:t>
       </w:r>
       <w:proofErr w:type="gramEnd"/>
+      <w:r>
+        <w:t xml:space="preserve">  </w:t>
+      </w:r>
+      <w:hyperlink r:id="rId33">
+        <w:r>
+          <w:drawing>
+            <wp:inline xmlns:a="http://schemas.openxmlformats.org/drawingml/2006/main" xmlns:pic="http://schemas.openxmlformats.org/drawingml/2006/picture">
+              <wp:extent cx="164592" cy="164592"/>
+              <wp:docPr id="20" name="Picture 20"/>
+              <wp:cNvGraphicFramePr>
+                <a:graphicFrameLocks noChangeAspect="1"/>
+              </wp:cNvGraphicFramePr>
+              <a:graphic>
+                <a:graphicData uri="http://schemas.openxmlformats.org/drawingml/2006/picture">
+                  <pic:pic>
+                    <pic:nvPicPr>
+                      <pic:cNvPr id="0" name="audio_play_icon.png"/>
+                      <pic:cNvPicPr/>
+                    </pic:nvPicPr>
+                    <pic:blipFill>
+                      <a:blip r:embed="rId17"/>
+                      <a:stretch>
+                        <a:fillRect/>
+                      </a:stretch>
+                    </pic:blipFill>
+                    <pic:spPr>
+                      <a:xfrm>
+                        <a:off x="0" y="0"/>
+                        <a:ext cx="164592" cy="164592"/>
+                      </a:xfrm>
+                      <a:prstGeom prst="rect"/>
+                    </pic:spPr>
+                  </pic:pic>
+                </a:graphicData>
+              </a:graphic>
+            </wp:inline>
+          </w:drawing>
+        </w:r>
+        <w:r>
+          <w:rPr>
+            <w:color w:val="0D47A1"/>
+            <w:u w:val="single"/>
+            <w:b/>
+            <w:sz w:val="21"/>
+          </w:rPr>
+          <w:t> [點擊播放音檔]</w:t>
+        </w:r>
+      </w:hyperlink>
     </w:p>
     <w:p>
       <w:pPr>
@@ -13284,6 +14244,54 @@
         </w:rPr>
         <w:t>)</w:t>
       </w:r>
+      <w:r>
+        <w:t xml:space="preserve">  </w:t>
+      </w:r>
+      <w:hyperlink r:id="rId34">
+        <w:r>
+          <w:drawing>
+            <wp:inline xmlns:a="http://schemas.openxmlformats.org/drawingml/2006/main" xmlns:pic="http://schemas.openxmlformats.org/drawingml/2006/picture">
+              <wp:extent cx="164592" cy="164592"/>
+              <wp:docPr id="21" name="Picture 21"/>
+              <wp:cNvGraphicFramePr>
+                <a:graphicFrameLocks noChangeAspect="1"/>
+              </wp:cNvGraphicFramePr>
+              <a:graphic>
+                <a:graphicData uri="http://schemas.openxmlformats.org/drawingml/2006/picture">
+                  <pic:pic>
+                    <pic:nvPicPr>
+                      <pic:cNvPr id="0" name="audio_play_icon.png"/>
+                      <pic:cNvPicPr/>
+                    </pic:nvPicPr>
+                    <pic:blipFill>
+                      <a:blip r:embed="rId17"/>
+                      <a:stretch>
+                        <a:fillRect/>
+                      </a:stretch>
+                    </pic:blipFill>
+                    <pic:spPr>
+                      <a:xfrm>
+                        <a:off x="0" y="0"/>
+                        <a:ext cx="164592" cy="164592"/>
+                      </a:xfrm>
+                      <a:prstGeom prst="rect"/>
+                    </pic:spPr>
+                  </pic:pic>
+                </a:graphicData>
+              </a:graphic>
+            </wp:inline>
+          </w:drawing>
+        </w:r>
+        <w:r>
+          <w:rPr>
+            <w:color w:val="0D47A1"/>
+            <w:u w:val="single"/>
+            <w:b/>
+            <w:sz w:val="21"/>
+          </w:rPr>
+          <w:t> [點擊播放音檔]</w:t>
+        </w:r>
+      </w:hyperlink>
     </w:p>
     <w:p>
       <w:pPr>
@@ -15222,6 +16230,54 @@
         <w:t>】</w:t>
       </w:r>
       <w:proofErr w:type="gramEnd"/>
+      <w:r>
+        <w:t xml:space="preserve">  </w:t>
+      </w:r>
+      <w:hyperlink r:id="rId35">
+        <w:r>
+          <w:drawing>
+            <wp:inline xmlns:a="http://schemas.openxmlformats.org/drawingml/2006/main" xmlns:pic="http://schemas.openxmlformats.org/drawingml/2006/picture">
+              <wp:extent cx="164592" cy="164592"/>
+              <wp:docPr id="22" name="Picture 22"/>
+              <wp:cNvGraphicFramePr>
+                <a:graphicFrameLocks noChangeAspect="1"/>
+              </wp:cNvGraphicFramePr>
+              <a:graphic>
+                <a:graphicData uri="http://schemas.openxmlformats.org/drawingml/2006/picture">
+                  <pic:pic>
+                    <pic:nvPicPr>
+                      <pic:cNvPr id="0" name="audio_play_icon.png"/>
+                      <pic:cNvPicPr/>
+                    </pic:nvPicPr>
+                    <pic:blipFill>
+                      <a:blip r:embed="rId17"/>
+                      <a:stretch>
+                        <a:fillRect/>
+                      </a:stretch>
+                    </pic:blipFill>
+                    <pic:spPr>
+                      <a:xfrm>
+                        <a:off x="0" y="0"/>
+                        <a:ext cx="164592" cy="164592"/>
+                      </a:xfrm>
+                      <a:prstGeom prst="rect"/>
+                    </pic:spPr>
+                  </pic:pic>
+                </a:graphicData>
+              </a:graphic>
+            </wp:inline>
+          </w:drawing>
+        </w:r>
+        <w:r>
+          <w:rPr>
+            <w:color w:val="0D47A1"/>
+            <w:u w:val="single"/>
+            <w:b/>
+            <w:sz w:val="21"/>
+          </w:rPr>
+          <w:t> [點擊播放音檔]</w:t>
+        </w:r>
+      </w:hyperlink>
     </w:p>
     <w:p>
       <w:pPr>
@@ -15681,6 +16737,54 @@
         </w:rPr>
         <w:t>)</w:t>
       </w:r>
+      <w:r>
+        <w:t xml:space="preserve">  </w:t>
+      </w:r>
+      <w:hyperlink r:id="rId36">
+        <w:r>
+          <w:drawing>
+            <wp:inline xmlns:a="http://schemas.openxmlformats.org/drawingml/2006/main" xmlns:pic="http://schemas.openxmlformats.org/drawingml/2006/picture">
+              <wp:extent cx="164592" cy="164592"/>
+              <wp:docPr id="23" name="Picture 23"/>
+              <wp:cNvGraphicFramePr>
+                <a:graphicFrameLocks noChangeAspect="1"/>
+              </wp:cNvGraphicFramePr>
+              <a:graphic>
+                <a:graphicData uri="http://schemas.openxmlformats.org/drawingml/2006/picture">
+                  <pic:pic>
+                    <pic:nvPicPr>
+                      <pic:cNvPr id="0" name="audio_play_icon.png"/>
+                      <pic:cNvPicPr/>
+                    </pic:nvPicPr>
+                    <pic:blipFill>
+                      <a:blip r:embed="rId17"/>
+                      <a:stretch>
+                        <a:fillRect/>
+                      </a:stretch>
+                    </pic:blipFill>
+                    <pic:spPr>
+                      <a:xfrm>
+                        <a:off x="0" y="0"/>
+                        <a:ext cx="164592" cy="164592"/>
+                      </a:xfrm>
+                      <a:prstGeom prst="rect"/>
+                    </pic:spPr>
+                  </pic:pic>
+                </a:graphicData>
+              </a:graphic>
+            </wp:inline>
+          </w:drawing>
+        </w:r>
+        <w:r>
+          <w:rPr>
+            <w:color w:val="0D47A1"/>
+            <w:u w:val="single"/>
+            <w:b/>
+            <w:sz w:val="21"/>
+          </w:rPr>
+          <w:t> [點擊播放音檔]</w:t>
+        </w:r>
+      </w:hyperlink>
     </w:p>
     <w:p>
       <w:pPr>
@@ -15800,6 +16904,54 @@
         <w:t>】</w:t>
       </w:r>
       <w:proofErr w:type="gramEnd"/>
+      <w:r>
+        <w:t xml:space="preserve">  </w:t>
+      </w:r>
+      <w:hyperlink r:id="rId36">
+        <w:r>
+          <w:drawing>
+            <wp:inline xmlns:a="http://schemas.openxmlformats.org/drawingml/2006/main" xmlns:pic="http://schemas.openxmlformats.org/drawingml/2006/picture">
+              <wp:extent cx="164592" cy="164592"/>
+              <wp:docPr id="24" name="Picture 24"/>
+              <wp:cNvGraphicFramePr>
+                <a:graphicFrameLocks noChangeAspect="1"/>
+              </wp:cNvGraphicFramePr>
+              <a:graphic>
+                <a:graphicData uri="http://schemas.openxmlformats.org/drawingml/2006/picture">
+                  <pic:pic>
+                    <pic:nvPicPr>
+                      <pic:cNvPr id="0" name="audio_play_icon.png"/>
+                      <pic:cNvPicPr/>
+                    </pic:nvPicPr>
+                    <pic:blipFill>
+                      <a:blip r:embed="rId17"/>
+                      <a:stretch>
+                        <a:fillRect/>
+                      </a:stretch>
+                    </pic:blipFill>
+                    <pic:spPr>
+                      <a:xfrm>
+                        <a:off x="0" y="0"/>
+                        <a:ext cx="164592" cy="164592"/>
+                      </a:xfrm>
+                      <a:prstGeom prst="rect"/>
+                    </pic:spPr>
+                  </pic:pic>
+                </a:graphicData>
+              </a:graphic>
+            </wp:inline>
+          </w:drawing>
+        </w:r>
+        <w:r>
+          <w:rPr>
+            <w:color w:val="0D47A1"/>
+            <w:u w:val="single"/>
+            <w:b/>
+            <w:sz w:val="21"/>
+          </w:rPr>
+          <w:t> [點擊播放音檔]</w:t>
+        </w:r>
+      </w:hyperlink>
     </w:p>
     <w:p>
       <w:pPr>
@@ -16294,6 +17446,54 @@
         <w:t>】</w:t>
       </w:r>
       <w:proofErr w:type="gramEnd"/>
+      <w:r>
+        <w:t xml:space="preserve">  </w:t>
+      </w:r>
+      <w:hyperlink r:id="rId37">
+        <w:r>
+          <w:drawing>
+            <wp:inline xmlns:a="http://schemas.openxmlformats.org/drawingml/2006/main" xmlns:pic="http://schemas.openxmlformats.org/drawingml/2006/picture">
+              <wp:extent cx="164592" cy="164592"/>
+              <wp:docPr id="25" name="Picture 25"/>
+              <wp:cNvGraphicFramePr>
+                <a:graphicFrameLocks noChangeAspect="1"/>
+              </wp:cNvGraphicFramePr>
+              <a:graphic>
+                <a:graphicData uri="http://schemas.openxmlformats.org/drawingml/2006/picture">
+                  <pic:pic>
+                    <pic:nvPicPr>
+                      <pic:cNvPr id="0" name="audio_play_icon.png"/>
+                      <pic:cNvPicPr/>
+                    </pic:nvPicPr>
+                    <pic:blipFill>
+                      <a:blip r:embed="rId17"/>
+                      <a:stretch>
+                        <a:fillRect/>
+                      </a:stretch>
+                    </pic:blipFill>
+                    <pic:spPr>
+                      <a:xfrm>
+                        <a:off x="0" y="0"/>
+                        <a:ext cx="164592" cy="164592"/>
+                      </a:xfrm>
+                      <a:prstGeom prst="rect"/>
+                    </pic:spPr>
+                  </pic:pic>
+                </a:graphicData>
+              </a:graphic>
+            </wp:inline>
+          </w:drawing>
+        </w:r>
+        <w:r>
+          <w:rPr>
+            <w:color w:val="0D47A1"/>
+            <w:u w:val="single"/>
+            <w:b/>
+            <w:sz w:val="21"/>
+          </w:rPr>
+          <w:t> [點擊播放音檔]</w:t>
+        </w:r>
+      </w:hyperlink>
     </w:p>
     <w:p>
       <w:pPr>
@@ -16772,6 +17972,54 @@
         <w:t>】</w:t>
       </w:r>
       <w:proofErr w:type="gramEnd"/>
+      <w:r>
+        <w:t xml:space="preserve">  </w:t>
+      </w:r>
+      <w:hyperlink r:id="rId38">
+        <w:r>
+          <w:drawing>
+            <wp:inline xmlns:a="http://schemas.openxmlformats.org/drawingml/2006/main" xmlns:pic="http://schemas.openxmlformats.org/drawingml/2006/picture">
+              <wp:extent cx="164592" cy="164592"/>
+              <wp:docPr id="26" name="Picture 26"/>
+              <wp:cNvGraphicFramePr>
+                <a:graphicFrameLocks noChangeAspect="1"/>
+              </wp:cNvGraphicFramePr>
+              <a:graphic>
+                <a:graphicData uri="http://schemas.openxmlformats.org/drawingml/2006/picture">
+                  <pic:pic>
+                    <pic:nvPicPr>
+                      <pic:cNvPr id="0" name="audio_play_icon.png"/>
+                      <pic:cNvPicPr/>
+                    </pic:nvPicPr>
+                    <pic:blipFill>
+                      <a:blip r:embed="rId17"/>
+                      <a:stretch>
+                        <a:fillRect/>
+                      </a:stretch>
+                    </pic:blipFill>
+                    <pic:spPr>
+                      <a:xfrm>
+                        <a:off x="0" y="0"/>
+                        <a:ext cx="164592" cy="164592"/>
+                      </a:xfrm>
+                      <a:prstGeom prst="rect"/>
+                    </pic:spPr>
+                  </pic:pic>
+                </a:graphicData>
+              </a:graphic>
+            </wp:inline>
+          </w:drawing>
+        </w:r>
+        <w:r>
+          <w:rPr>
+            <w:color w:val="0D47A1"/>
+            <w:u w:val="single"/>
+            <w:b/>
+            <w:sz w:val="21"/>
+          </w:rPr>
+          <w:t> [點擊播放音檔]</w:t>
+        </w:r>
+      </w:hyperlink>
     </w:p>
     <w:p>
       <w:pPr>
@@ -17315,6 +18563,54 @@
         <w:t>】</w:t>
       </w:r>
       <w:proofErr w:type="gramEnd"/>
+      <w:r>
+        <w:t xml:space="preserve">  </w:t>
+      </w:r>
+      <w:hyperlink r:id="rId39">
+        <w:r>
+          <w:drawing>
+            <wp:inline xmlns:a="http://schemas.openxmlformats.org/drawingml/2006/main" xmlns:pic="http://schemas.openxmlformats.org/drawingml/2006/picture">
+              <wp:extent cx="164592" cy="164592"/>
+              <wp:docPr id="27" name="Picture 27"/>
+              <wp:cNvGraphicFramePr>
+                <a:graphicFrameLocks noChangeAspect="1"/>
+              </wp:cNvGraphicFramePr>
+              <a:graphic>
+                <a:graphicData uri="http://schemas.openxmlformats.org/drawingml/2006/picture">
+                  <pic:pic>
+                    <pic:nvPicPr>
+                      <pic:cNvPr id="0" name="audio_play_icon.png"/>
+                      <pic:cNvPicPr/>
+                    </pic:nvPicPr>
+                    <pic:blipFill>
+                      <a:blip r:embed="rId17"/>
+                      <a:stretch>
+                        <a:fillRect/>
+                      </a:stretch>
+                    </pic:blipFill>
+                    <pic:spPr>
+                      <a:xfrm>
+                        <a:off x="0" y="0"/>
+                        <a:ext cx="164592" cy="164592"/>
+                      </a:xfrm>
+                      <a:prstGeom prst="rect"/>
+                    </pic:spPr>
+                  </pic:pic>
+                </a:graphicData>
+              </a:graphic>
+            </wp:inline>
+          </w:drawing>
+        </w:r>
+        <w:r>
+          <w:rPr>
+            <w:color w:val="0D47A1"/>
+            <w:u w:val="single"/>
+            <w:b/>
+            <w:sz w:val="21"/>
+          </w:rPr>
+          <w:t> [點擊播放音檔]</w:t>
+        </w:r>
+      </w:hyperlink>
     </w:p>
     <w:p>
       <w:pPr>
@@ -18167,6 +19463,54 @@
         </w:rPr>
         <w:t>)</w:t>
       </w:r>
+      <w:r>
+        <w:t xml:space="preserve">  </w:t>
+      </w:r>
+      <w:hyperlink r:id="rId40">
+        <w:r>
+          <w:drawing>
+            <wp:inline xmlns:a="http://schemas.openxmlformats.org/drawingml/2006/main" xmlns:pic="http://schemas.openxmlformats.org/drawingml/2006/picture">
+              <wp:extent cx="164592" cy="164592"/>
+              <wp:docPr id="28" name="Picture 28"/>
+              <wp:cNvGraphicFramePr>
+                <a:graphicFrameLocks noChangeAspect="1"/>
+              </wp:cNvGraphicFramePr>
+              <a:graphic>
+                <a:graphicData uri="http://schemas.openxmlformats.org/drawingml/2006/picture">
+                  <pic:pic>
+                    <pic:nvPicPr>
+                      <pic:cNvPr id="0" name="audio_play_icon.png"/>
+                      <pic:cNvPicPr/>
+                    </pic:nvPicPr>
+                    <pic:blipFill>
+                      <a:blip r:embed="rId17"/>
+                      <a:stretch>
+                        <a:fillRect/>
+                      </a:stretch>
+                    </pic:blipFill>
+                    <pic:spPr>
+                      <a:xfrm>
+                        <a:off x="0" y="0"/>
+                        <a:ext cx="164592" cy="164592"/>
+                      </a:xfrm>
+                      <a:prstGeom prst="rect"/>
+                    </pic:spPr>
+                  </pic:pic>
+                </a:graphicData>
+              </a:graphic>
+            </wp:inline>
+          </w:drawing>
+        </w:r>
+        <w:r>
+          <w:rPr>
+            <w:color w:val="0D47A1"/>
+            <w:u w:val="single"/>
+            <w:b/>
+            <w:sz w:val="21"/>
+          </w:rPr>
+          <w:t> [點擊播放音檔]</w:t>
+        </w:r>
+      </w:hyperlink>
     </w:p>
     <w:p>
       <w:pPr>
@@ -18624,6 +19968,54 @@
         <w:t>】</w:t>
       </w:r>
       <w:proofErr w:type="gramEnd"/>
+      <w:r>
+        <w:t xml:space="preserve">  </w:t>
+      </w:r>
+      <w:hyperlink r:id="rId41">
+        <w:r>
+          <w:drawing>
+            <wp:inline xmlns:a="http://schemas.openxmlformats.org/drawingml/2006/main" xmlns:pic="http://schemas.openxmlformats.org/drawingml/2006/picture">
+              <wp:extent cx="164592" cy="164592"/>
+              <wp:docPr id="29" name="Picture 29"/>
+              <wp:cNvGraphicFramePr>
+                <a:graphicFrameLocks noChangeAspect="1"/>
+              </wp:cNvGraphicFramePr>
+              <a:graphic>
+                <a:graphicData uri="http://schemas.openxmlformats.org/drawingml/2006/picture">
+                  <pic:pic>
+                    <pic:nvPicPr>
+                      <pic:cNvPr id="0" name="audio_play_icon.png"/>
+                      <pic:cNvPicPr/>
+                    </pic:nvPicPr>
+                    <pic:blipFill>
+                      <a:blip r:embed="rId17"/>
+                      <a:stretch>
+                        <a:fillRect/>
+                      </a:stretch>
+                    </pic:blipFill>
+                    <pic:spPr>
+                      <a:xfrm>
+                        <a:off x="0" y="0"/>
+                        <a:ext cx="164592" cy="164592"/>
+                      </a:xfrm>
+                      <a:prstGeom prst="rect"/>
+                    </pic:spPr>
+                  </pic:pic>
+                </a:graphicData>
+              </a:graphic>
+            </wp:inline>
+          </w:drawing>
+        </w:r>
+        <w:r>
+          <w:rPr>
+            <w:color w:val="0D47A1"/>
+            <w:u w:val="single"/>
+            <w:b/>
+            <w:sz w:val="21"/>
+          </w:rPr>
+          <w:t> [點擊播放音檔]</w:t>
+        </w:r>
+      </w:hyperlink>
     </w:p>
     <w:p>
       <w:pPr>
@@ -20016,6 +21408,54 @@
         <w:t>】</w:t>
       </w:r>
       <w:proofErr w:type="gramEnd"/>
+      <w:r>
+        <w:t xml:space="preserve">  </w:t>
+      </w:r>
+      <w:hyperlink r:id="rId42">
+        <w:r>
+          <w:drawing>
+            <wp:inline xmlns:a="http://schemas.openxmlformats.org/drawingml/2006/main" xmlns:pic="http://schemas.openxmlformats.org/drawingml/2006/picture">
+              <wp:extent cx="164592" cy="164592"/>
+              <wp:docPr id="30" name="Picture 30"/>
+              <wp:cNvGraphicFramePr>
+                <a:graphicFrameLocks noChangeAspect="1"/>
+              </wp:cNvGraphicFramePr>
+              <a:graphic>
+                <a:graphicData uri="http://schemas.openxmlformats.org/drawingml/2006/picture">
+                  <pic:pic>
+                    <pic:nvPicPr>
+                      <pic:cNvPr id="0" name="audio_play_icon.png"/>
+                      <pic:cNvPicPr/>
+                    </pic:nvPicPr>
+                    <pic:blipFill>
+                      <a:blip r:embed="rId17"/>
+                      <a:stretch>
+                        <a:fillRect/>
+                      </a:stretch>
+                    </pic:blipFill>
+                    <pic:spPr>
+                      <a:xfrm>
+                        <a:off x="0" y="0"/>
+                        <a:ext cx="164592" cy="164592"/>
+                      </a:xfrm>
+                      <a:prstGeom prst="rect"/>
+                    </pic:spPr>
+                  </pic:pic>
+                </a:graphicData>
+              </a:graphic>
+            </wp:inline>
+          </w:drawing>
+        </w:r>
+        <w:r>
+          <w:rPr>
+            <w:color w:val="0D47A1"/>
+            <w:u w:val="single"/>
+            <w:b/>
+            <w:sz w:val="21"/>
+          </w:rPr>
+          <w:t> [點擊播放音檔]</w:t>
+        </w:r>
+      </w:hyperlink>
     </w:p>
     <w:p>
       <w:pPr>
@@ -20650,6 +22090,54 @@
         <w:t>】</w:t>
       </w:r>
       <w:proofErr w:type="gramEnd"/>
+      <w:r>
+        <w:t xml:space="preserve">  </w:t>
+      </w:r>
+      <w:hyperlink r:id="rId42">
+        <w:r>
+          <w:drawing>
+            <wp:inline xmlns:a="http://schemas.openxmlformats.org/drawingml/2006/main" xmlns:pic="http://schemas.openxmlformats.org/drawingml/2006/picture">
+              <wp:extent cx="164592" cy="164592"/>
+              <wp:docPr id="31" name="Picture 31"/>
+              <wp:cNvGraphicFramePr>
+                <a:graphicFrameLocks noChangeAspect="1"/>
+              </wp:cNvGraphicFramePr>
+              <a:graphic>
+                <a:graphicData uri="http://schemas.openxmlformats.org/drawingml/2006/picture">
+                  <pic:pic>
+                    <pic:nvPicPr>
+                      <pic:cNvPr id="0" name="audio_play_icon.png"/>
+                      <pic:cNvPicPr/>
+                    </pic:nvPicPr>
+                    <pic:blipFill>
+                      <a:blip r:embed="rId17"/>
+                      <a:stretch>
+                        <a:fillRect/>
+                      </a:stretch>
+                    </pic:blipFill>
+                    <pic:spPr>
+                      <a:xfrm>
+                        <a:off x="0" y="0"/>
+                        <a:ext cx="164592" cy="164592"/>
+                      </a:xfrm>
+                      <a:prstGeom prst="rect"/>
+                    </pic:spPr>
+                  </pic:pic>
+                </a:graphicData>
+              </a:graphic>
+            </wp:inline>
+          </w:drawing>
+        </w:r>
+        <w:r>
+          <w:rPr>
+            <w:color w:val="0D47A1"/>
+            <w:u w:val="single"/>
+            <w:b/>
+            <w:sz w:val="21"/>
+          </w:rPr>
+          <w:t> [點擊播放音檔]</w:t>
+        </w:r>
+      </w:hyperlink>
     </w:p>
     <w:p>
       <w:pPr>
@@ -20962,6 +22450,54 @@
         <w:t>】</w:t>
       </w:r>
       <w:proofErr w:type="gramEnd"/>
+      <w:r>
+        <w:t xml:space="preserve">  </w:t>
+      </w:r>
+      <w:hyperlink r:id="rId43">
+        <w:r>
+          <w:drawing>
+            <wp:inline xmlns:a="http://schemas.openxmlformats.org/drawingml/2006/main" xmlns:pic="http://schemas.openxmlformats.org/drawingml/2006/picture">
+              <wp:extent cx="164592" cy="164592"/>
+              <wp:docPr id="32" name="Picture 32"/>
+              <wp:cNvGraphicFramePr>
+                <a:graphicFrameLocks noChangeAspect="1"/>
+              </wp:cNvGraphicFramePr>
+              <a:graphic>
+                <a:graphicData uri="http://schemas.openxmlformats.org/drawingml/2006/picture">
+                  <pic:pic>
+                    <pic:nvPicPr>
+                      <pic:cNvPr id="0" name="audio_play_icon.png"/>
+                      <pic:cNvPicPr/>
+                    </pic:nvPicPr>
+                    <pic:blipFill>
+                      <a:blip r:embed="rId17"/>
+                      <a:stretch>
+                        <a:fillRect/>
+                      </a:stretch>
+                    </pic:blipFill>
+                    <pic:spPr>
+                      <a:xfrm>
+                        <a:off x="0" y="0"/>
+                        <a:ext cx="164592" cy="164592"/>
+                      </a:xfrm>
+                      <a:prstGeom prst="rect"/>
+                    </pic:spPr>
+                  </pic:pic>
+                </a:graphicData>
+              </a:graphic>
+            </wp:inline>
+          </w:drawing>
+        </w:r>
+        <w:r>
+          <w:rPr>
+            <w:color w:val="0D47A1"/>
+            <w:u w:val="single"/>
+            <w:b/>
+            <w:sz w:val="21"/>
+          </w:rPr>
+          <w:t> [點擊播放音檔]</w:t>
+        </w:r>
+      </w:hyperlink>
     </w:p>
     <w:p>
       <w:pPr>
@@ -21510,6 +23046,54 @@
         <w:t>】</w:t>
       </w:r>
       <w:proofErr w:type="gramEnd"/>
+      <w:r>
+        <w:t xml:space="preserve">  </w:t>
+      </w:r>
+      <w:hyperlink r:id="rId44">
+        <w:r>
+          <w:drawing>
+            <wp:inline xmlns:a="http://schemas.openxmlformats.org/drawingml/2006/main" xmlns:pic="http://schemas.openxmlformats.org/drawingml/2006/picture">
+              <wp:extent cx="164592" cy="164592"/>
+              <wp:docPr id="33" name="Picture 33"/>
+              <wp:cNvGraphicFramePr>
+                <a:graphicFrameLocks noChangeAspect="1"/>
+              </wp:cNvGraphicFramePr>
+              <a:graphic>
+                <a:graphicData uri="http://schemas.openxmlformats.org/drawingml/2006/picture">
+                  <pic:pic>
+                    <pic:nvPicPr>
+                      <pic:cNvPr id="0" name="audio_play_icon.png"/>
+                      <pic:cNvPicPr/>
+                    </pic:nvPicPr>
+                    <pic:blipFill>
+                      <a:blip r:embed="rId17"/>
+                      <a:stretch>
+                        <a:fillRect/>
+                      </a:stretch>
+                    </pic:blipFill>
+                    <pic:spPr>
+                      <a:xfrm>
+                        <a:off x="0" y="0"/>
+                        <a:ext cx="164592" cy="164592"/>
+                      </a:xfrm>
+                      <a:prstGeom prst="rect"/>
+                    </pic:spPr>
+                  </pic:pic>
+                </a:graphicData>
+              </a:graphic>
+            </wp:inline>
+          </w:drawing>
+        </w:r>
+        <w:r>
+          <w:rPr>
+            <w:color w:val="0D47A1"/>
+            <w:u w:val="single"/>
+            <w:b/>
+            <w:sz w:val="21"/>
+          </w:rPr>
+          <w:t> [點擊播放音檔]</w:t>
+        </w:r>
+      </w:hyperlink>
     </w:p>
     <w:p>
       <w:pPr>
@@ -22090,6 +23674,54 @@
         <w:t>】</w:t>
       </w:r>
       <w:proofErr w:type="gramEnd"/>
+      <w:r>
+        <w:t xml:space="preserve">  </w:t>
+      </w:r>
+      <w:hyperlink r:id="rId45">
+        <w:r>
+          <w:drawing>
+            <wp:inline xmlns:a="http://schemas.openxmlformats.org/drawingml/2006/main" xmlns:pic="http://schemas.openxmlformats.org/drawingml/2006/picture">
+              <wp:extent cx="164592" cy="164592"/>
+              <wp:docPr id="34" name="Picture 34"/>
+              <wp:cNvGraphicFramePr>
+                <a:graphicFrameLocks noChangeAspect="1"/>
+              </wp:cNvGraphicFramePr>
+              <a:graphic>
+                <a:graphicData uri="http://schemas.openxmlformats.org/drawingml/2006/picture">
+                  <pic:pic>
+                    <pic:nvPicPr>
+                      <pic:cNvPr id="0" name="audio_play_icon.png"/>
+                      <pic:cNvPicPr/>
+                    </pic:nvPicPr>
+                    <pic:blipFill>
+                      <a:blip r:embed="rId17"/>
+                      <a:stretch>
+                        <a:fillRect/>
+                      </a:stretch>
+                    </pic:blipFill>
+                    <pic:spPr>
+                      <a:xfrm>
+                        <a:off x="0" y="0"/>
+                        <a:ext cx="164592" cy="164592"/>
+                      </a:xfrm>
+                      <a:prstGeom prst="rect"/>
+                    </pic:spPr>
+                  </pic:pic>
+                </a:graphicData>
+              </a:graphic>
+            </wp:inline>
+          </w:drawing>
+        </w:r>
+        <w:r>
+          <w:rPr>
+            <w:color w:val="0D47A1"/>
+            <w:u w:val="single"/>
+            <w:b/>
+            <w:sz w:val="21"/>
+          </w:rPr>
+          <w:t> [點擊播放音檔]</w:t>
+        </w:r>
+      </w:hyperlink>
     </w:p>
     <w:p>
       <w:pPr>
@@ -23691,6 +25323,54 @@
         <w:t>】</w:t>
       </w:r>
       <w:proofErr w:type="gramEnd"/>
+      <w:r>
+        <w:t xml:space="preserve">  </w:t>
+      </w:r>
+      <w:hyperlink r:id="rId46">
+        <w:r>
+          <w:drawing>
+            <wp:inline xmlns:a="http://schemas.openxmlformats.org/drawingml/2006/main" xmlns:pic="http://schemas.openxmlformats.org/drawingml/2006/picture">
+              <wp:extent cx="164592" cy="164592"/>
+              <wp:docPr id="35" name="Picture 35"/>
+              <wp:cNvGraphicFramePr>
+                <a:graphicFrameLocks noChangeAspect="1"/>
+              </wp:cNvGraphicFramePr>
+              <a:graphic>
+                <a:graphicData uri="http://schemas.openxmlformats.org/drawingml/2006/picture">
+                  <pic:pic>
+                    <pic:nvPicPr>
+                      <pic:cNvPr id="0" name="audio_play_icon.png"/>
+                      <pic:cNvPicPr/>
+                    </pic:nvPicPr>
+                    <pic:blipFill>
+                      <a:blip r:embed="rId17"/>
+                      <a:stretch>
+                        <a:fillRect/>
+                      </a:stretch>
+                    </pic:blipFill>
+                    <pic:spPr>
+                      <a:xfrm>
+                        <a:off x="0" y="0"/>
+                        <a:ext cx="164592" cy="164592"/>
+                      </a:xfrm>
+                      <a:prstGeom prst="rect"/>
+                    </pic:spPr>
+                  </pic:pic>
+                </a:graphicData>
+              </a:graphic>
+            </wp:inline>
+          </w:drawing>
+        </w:r>
+        <w:r>
+          <w:rPr>
+            <w:color w:val="0D47A1"/>
+            <w:u w:val="single"/>
+            <w:b/>
+            <w:sz w:val="21"/>
+          </w:rPr>
+          <w:t> [點擊播放音檔]</w:t>
+        </w:r>
+      </w:hyperlink>
     </w:p>
     <w:p>
       <w:pPr>
@@ -24597,6 +26277,54 @@
         </w:rPr>
         <w:t>)</w:t>
       </w:r>
+      <w:r>
+        <w:t xml:space="preserve">  </w:t>
+      </w:r>
+      <w:hyperlink r:id="rId47">
+        <w:r>
+          <w:drawing>
+            <wp:inline xmlns:a="http://schemas.openxmlformats.org/drawingml/2006/main" xmlns:pic="http://schemas.openxmlformats.org/drawingml/2006/picture">
+              <wp:extent cx="164592" cy="164592"/>
+              <wp:docPr id="36" name="Picture 36"/>
+              <wp:cNvGraphicFramePr>
+                <a:graphicFrameLocks noChangeAspect="1"/>
+              </wp:cNvGraphicFramePr>
+              <a:graphic>
+                <a:graphicData uri="http://schemas.openxmlformats.org/drawingml/2006/picture">
+                  <pic:pic>
+                    <pic:nvPicPr>
+                      <pic:cNvPr id="0" name="audio_play_icon.png"/>
+                      <pic:cNvPicPr/>
+                    </pic:nvPicPr>
+                    <pic:blipFill>
+                      <a:blip r:embed="rId17"/>
+                      <a:stretch>
+                        <a:fillRect/>
+                      </a:stretch>
+                    </pic:blipFill>
+                    <pic:spPr>
+                      <a:xfrm>
+                        <a:off x="0" y="0"/>
+                        <a:ext cx="164592" cy="164592"/>
+                      </a:xfrm>
+                      <a:prstGeom prst="rect"/>
+                    </pic:spPr>
+                  </pic:pic>
+                </a:graphicData>
+              </a:graphic>
+            </wp:inline>
+          </w:drawing>
+        </w:r>
+        <w:r>
+          <w:rPr>
+            <w:color w:val="0D47A1"/>
+            <w:u w:val="single"/>
+            <w:b/>
+            <w:sz w:val="21"/>
+          </w:rPr>
+          <w:t> [點擊播放音檔]</w:t>
+        </w:r>
+      </w:hyperlink>
     </w:p>
     <w:p>
       <w:pPr>
@@ -25088,6 +26816,54 @@
         </w:rPr>
         <w:t>)</w:t>
       </w:r>
+      <w:r>
+        <w:t xml:space="preserve">  </w:t>
+      </w:r>
+      <w:hyperlink r:id="rId48">
+        <w:r>
+          <w:drawing>
+            <wp:inline xmlns:a="http://schemas.openxmlformats.org/drawingml/2006/main" xmlns:pic="http://schemas.openxmlformats.org/drawingml/2006/picture">
+              <wp:extent cx="164592" cy="164592"/>
+              <wp:docPr id="37" name="Picture 37"/>
+              <wp:cNvGraphicFramePr>
+                <a:graphicFrameLocks noChangeAspect="1"/>
+              </wp:cNvGraphicFramePr>
+              <a:graphic>
+                <a:graphicData uri="http://schemas.openxmlformats.org/drawingml/2006/picture">
+                  <pic:pic>
+                    <pic:nvPicPr>
+                      <pic:cNvPr id="0" name="audio_play_icon.png"/>
+                      <pic:cNvPicPr/>
+                    </pic:nvPicPr>
+                    <pic:blipFill>
+                      <a:blip r:embed="rId17"/>
+                      <a:stretch>
+                        <a:fillRect/>
+                      </a:stretch>
+                    </pic:blipFill>
+                    <pic:spPr>
+                      <a:xfrm>
+                        <a:off x="0" y="0"/>
+                        <a:ext cx="164592" cy="164592"/>
+                      </a:xfrm>
+                      <a:prstGeom prst="rect"/>
+                    </pic:spPr>
+                  </pic:pic>
+                </a:graphicData>
+              </a:graphic>
+            </wp:inline>
+          </w:drawing>
+        </w:r>
+        <w:r>
+          <w:rPr>
+            <w:color w:val="0D47A1"/>
+            <w:u w:val="single"/>
+            <w:b/>
+            <w:sz w:val="21"/>
+          </w:rPr>
+          <w:t> [點擊播放音檔]</w:t>
+        </w:r>
+      </w:hyperlink>
     </w:p>
     <w:p>
       <w:pPr>
@@ -26528,6 +28304,54 @@
         </w:rPr>
         <w:t>)</w:t>
       </w:r>
+      <w:r>
+        <w:t xml:space="preserve">  </w:t>
+      </w:r>
+      <w:hyperlink r:id="rId48">
+        <w:r>
+          <w:drawing>
+            <wp:inline xmlns:a="http://schemas.openxmlformats.org/drawingml/2006/main" xmlns:pic="http://schemas.openxmlformats.org/drawingml/2006/picture">
+              <wp:extent cx="164592" cy="164592"/>
+              <wp:docPr id="38" name="Picture 38"/>
+              <wp:cNvGraphicFramePr>
+                <a:graphicFrameLocks noChangeAspect="1"/>
+              </wp:cNvGraphicFramePr>
+              <a:graphic>
+                <a:graphicData uri="http://schemas.openxmlformats.org/drawingml/2006/picture">
+                  <pic:pic>
+                    <pic:nvPicPr>
+                      <pic:cNvPr id="0" name="audio_play_icon.png"/>
+                      <pic:cNvPicPr/>
+                    </pic:nvPicPr>
+                    <pic:blipFill>
+                      <a:blip r:embed="rId17"/>
+                      <a:stretch>
+                        <a:fillRect/>
+                      </a:stretch>
+                    </pic:blipFill>
+                    <pic:spPr>
+                      <a:xfrm>
+                        <a:off x="0" y="0"/>
+                        <a:ext cx="164592" cy="164592"/>
+                      </a:xfrm>
+                      <a:prstGeom prst="rect"/>
+                    </pic:spPr>
+                  </pic:pic>
+                </a:graphicData>
+              </a:graphic>
+            </wp:inline>
+          </w:drawing>
+        </w:r>
+        <w:r>
+          <w:rPr>
+            <w:color w:val="0D47A1"/>
+            <w:u w:val="single"/>
+            <w:b/>
+            <w:sz w:val="21"/>
+          </w:rPr>
+          <w:t> [點擊播放音檔]</w:t>
+        </w:r>
+      </w:hyperlink>
     </w:p>
     <w:p>
       <w:pPr>
@@ -27976,6 +29800,54 @@
         <w:t>】</w:t>
       </w:r>
       <w:proofErr w:type="gramEnd"/>
+      <w:r>
+        <w:t xml:space="preserve">  </w:t>
+      </w:r>
+      <w:hyperlink r:id="rId49">
+        <w:r>
+          <w:drawing>
+            <wp:inline xmlns:a="http://schemas.openxmlformats.org/drawingml/2006/main" xmlns:pic="http://schemas.openxmlformats.org/drawingml/2006/picture">
+              <wp:extent cx="164592" cy="164592"/>
+              <wp:docPr id="39" name="Picture 39"/>
+              <wp:cNvGraphicFramePr>
+                <a:graphicFrameLocks noChangeAspect="1"/>
+              </wp:cNvGraphicFramePr>
+              <a:graphic>
+                <a:graphicData uri="http://schemas.openxmlformats.org/drawingml/2006/picture">
+                  <pic:pic>
+                    <pic:nvPicPr>
+                      <pic:cNvPr id="0" name="audio_play_icon.png"/>
+                      <pic:cNvPicPr/>
+                    </pic:nvPicPr>
+                    <pic:blipFill>
+                      <a:blip r:embed="rId17"/>
+                      <a:stretch>
+                        <a:fillRect/>
+                      </a:stretch>
+                    </pic:blipFill>
+                    <pic:spPr>
+                      <a:xfrm>
+                        <a:off x="0" y="0"/>
+                        <a:ext cx="164592" cy="164592"/>
+                      </a:xfrm>
+                      <a:prstGeom prst="rect"/>
+                    </pic:spPr>
+                  </pic:pic>
+                </a:graphicData>
+              </a:graphic>
+            </wp:inline>
+          </w:drawing>
+        </w:r>
+        <w:r>
+          <w:rPr>
+            <w:color w:val="0D47A1"/>
+            <w:u w:val="single"/>
+            <w:b/>
+            <w:sz w:val="21"/>
+          </w:rPr>
+          <w:t> [點擊播放音檔]</w:t>
+        </w:r>
+      </w:hyperlink>
     </w:p>
     <w:p>
       <w:pPr>
@@ -28230,6 +30102,54 @@
         <w:t>】</w:t>
       </w:r>
       <w:proofErr w:type="gramEnd"/>
+      <w:r>
+        <w:t xml:space="preserve">  </w:t>
+      </w:r>
+      <w:hyperlink r:id="rId50">
+        <w:r>
+          <w:drawing>
+            <wp:inline xmlns:a="http://schemas.openxmlformats.org/drawingml/2006/main" xmlns:pic="http://schemas.openxmlformats.org/drawingml/2006/picture">
+              <wp:extent cx="164592" cy="164592"/>
+              <wp:docPr id="40" name="Picture 40"/>
+              <wp:cNvGraphicFramePr>
+                <a:graphicFrameLocks noChangeAspect="1"/>
+              </wp:cNvGraphicFramePr>
+              <a:graphic>
+                <a:graphicData uri="http://schemas.openxmlformats.org/drawingml/2006/picture">
+                  <pic:pic>
+                    <pic:nvPicPr>
+                      <pic:cNvPr id="0" name="audio_play_icon.png"/>
+                      <pic:cNvPicPr/>
+                    </pic:nvPicPr>
+                    <pic:blipFill>
+                      <a:blip r:embed="rId17"/>
+                      <a:stretch>
+                        <a:fillRect/>
+                      </a:stretch>
+                    </pic:blipFill>
+                    <pic:spPr>
+                      <a:xfrm>
+                        <a:off x="0" y="0"/>
+                        <a:ext cx="164592" cy="164592"/>
+                      </a:xfrm>
+                      <a:prstGeom prst="rect"/>
+                    </pic:spPr>
+                  </pic:pic>
+                </a:graphicData>
+              </a:graphic>
+            </wp:inline>
+          </w:drawing>
+        </w:r>
+        <w:r>
+          <w:rPr>
+            <w:color w:val="0D47A1"/>
+            <w:u w:val="single"/>
+            <w:b/>
+            <w:sz w:val="21"/>
+          </w:rPr>
+          <w:t> [點擊播放音檔]</w:t>
+        </w:r>
+      </w:hyperlink>
     </w:p>
     <w:p>
       <w:pPr>
@@ -28413,6 +30333,54 @@
         <w:t>】</w:t>
       </w:r>
       <w:proofErr w:type="gramEnd"/>
+      <w:r>
+        <w:t xml:space="preserve">  </w:t>
+      </w:r>
+      <w:hyperlink r:id="rId51">
+        <w:r>
+          <w:drawing>
+            <wp:inline xmlns:a="http://schemas.openxmlformats.org/drawingml/2006/main" xmlns:pic="http://schemas.openxmlformats.org/drawingml/2006/picture">
+              <wp:extent cx="164592" cy="164592"/>
+              <wp:docPr id="41" name="Picture 41"/>
+              <wp:cNvGraphicFramePr>
+                <a:graphicFrameLocks noChangeAspect="1"/>
+              </wp:cNvGraphicFramePr>
+              <a:graphic>
+                <a:graphicData uri="http://schemas.openxmlformats.org/drawingml/2006/picture">
+                  <pic:pic>
+                    <pic:nvPicPr>
+                      <pic:cNvPr id="0" name="audio_play_icon.png"/>
+                      <pic:cNvPicPr/>
+                    </pic:nvPicPr>
+                    <pic:blipFill>
+                      <a:blip r:embed="rId17"/>
+                      <a:stretch>
+                        <a:fillRect/>
+                      </a:stretch>
+                    </pic:blipFill>
+                    <pic:spPr>
+                      <a:xfrm>
+                        <a:off x="0" y="0"/>
+                        <a:ext cx="164592" cy="164592"/>
+                      </a:xfrm>
+                      <a:prstGeom prst="rect"/>
+                    </pic:spPr>
+                  </pic:pic>
+                </a:graphicData>
+              </a:graphic>
+            </wp:inline>
+          </w:drawing>
+        </w:r>
+        <w:r>
+          <w:rPr>
+            <w:color w:val="0D47A1"/>
+            <w:u w:val="single"/>
+            <w:b/>
+            <w:sz w:val="21"/>
+          </w:rPr>
+          <w:t> [點擊播放音檔]</w:t>
+        </w:r>
+      </w:hyperlink>
     </w:p>
     <w:p>
       <w:pPr>
@@ -28701,6 +30669,54 @@
         <w:t>】</w:t>
       </w:r>
       <w:proofErr w:type="gramEnd"/>
+      <w:r>
+        <w:t xml:space="preserve">  </w:t>
+      </w:r>
+      <w:hyperlink r:id="rId52">
+        <w:r>
+          <w:drawing>
+            <wp:inline xmlns:a="http://schemas.openxmlformats.org/drawingml/2006/main" xmlns:pic="http://schemas.openxmlformats.org/drawingml/2006/picture">
+              <wp:extent cx="164592" cy="164592"/>
+              <wp:docPr id="42" name="Picture 42"/>
+              <wp:cNvGraphicFramePr>
+                <a:graphicFrameLocks noChangeAspect="1"/>
+              </wp:cNvGraphicFramePr>
+              <a:graphic>
+                <a:graphicData uri="http://schemas.openxmlformats.org/drawingml/2006/picture">
+                  <pic:pic>
+                    <pic:nvPicPr>
+                      <pic:cNvPr id="0" name="audio_play_icon.png"/>
+                      <pic:cNvPicPr/>
+                    </pic:nvPicPr>
+                    <pic:blipFill>
+                      <a:blip r:embed="rId17"/>
+                      <a:stretch>
+                        <a:fillRect/>
+                      </a:stretch>
+                    </pic:blipFill>
+                    <pic:spPr>
+                      <a:xfrm>
+                        <a:off x="0" y="0"/>
+                        <a:ext cx="164592" cy="164592"/>
+                      </a:xfrm>
+                      <a:prstGeom prst="rect"/>
+                    </pic:spPr>
+                  </pic:pic>
+                </a:graphicData>
+              </a:graphic>
+            </wp:inline>
+          </w:drawing>
+        </w:r>
+        <w:r>
+          <w:rPr>
+            <w:color w:val="0D47A1"/>
+            <w:u w:val="single"/>
+            <w:b/>
+            <w:sz w:val="21"/>
+          </w:rPr>
+          <w:t> [點擊播放音檔]</w:t>
+        </w:r>
+      </w:hyperlink>
     </w:p>
     <w:p>
       <w:pPr>
@@ -28890,6 +30906,54 @@
         <w:t>】</w:t>
       </w:r>
       <w:proofErr w:type="gramEnd"/>
+      <w:r>
+        <w:t xml:space="preserve">  </w:t>
+      </w:r>
+      <w:hyperlink r:id="rId53">
+        <w:r>
+          <w:drawing>
+            <wp:inline xmlns:a="http://schemas.openxmlformats.org/drawingml/2006/main" xmlns:pic="http://schemas.openxmlformats.org/drawingml/2006/picture">
+              <wp:extent cx="164592" cy="164592"/>
+              <wp:docPr id="43" name="Picture 43"/>
+              <wp:cNvGraphicFramePr>
+                <a:graphicFrameLocks noChangeAspect="1"/>
+              </wp:cNvGraphicFramePr>
+              <a:graphic>
+                <a:graphicData uri="http://schemas.openxmlformats.org/drawingml/2006/picture">
+                  <pic:pic>
+                    <pic:nvPicPr>
+                      <pic:cNvPr id="0" name="audio_play_icon.png"/>
+                      <pic:cNvPicPr/>
+                    </pic:nvPicPr>
+                    <pic:blipFill>
+                      <a:blip r:embed="rId17"/>
+                      <a:stretch>
+                        <a:fillRect/>
+                      </a:stretch>
+                    </pic:blipFill>
+                    <pic:spPr>
+                      <a:xfrm>
+                        <a:off x="0" y="0"/>
+                        <a:ext cx="164592" cy="164592"/>
+                      </a:xfrm>
+                      <a:prstGeom prst="rect"/>
+                    </pic:spPr>
+                  </pic:pic>
+                </a:graphicData>
+              </a:graphic>
+            </wp:inline>
+          </w:drawing>
+        </w:r>
+        <w:r>
+          <w:rPr>
+            <w:color w:val="0D47A1"/>
+            <w:u w:val="single"/>
+            <w:b/>
+            <w:sz w:val="21"/>
+          </w:rPr>
+          <w:t> [點擊播放音檔]</w:t>
+        </w:r>
+      </w:hyperlink>
     </w:p>
     <w:p>
       <w:pPr>
@@ -29198,6 +31262,54 @@
         <w:t>】</w:t>
       </w:r>
       <w:proofErr w:type="gramEnd"/>
+      <w:r>
+        <w:t xml:space="preserve">  </w:t>
+      </w:r>
+      <w:hyperlink r:id="rId54">
+        <w:r>
+          <w:drawing>
+            <wp:inline xmlns:a="http://schemas.openxmlformats.org/drawingml/2006/main" xmlns:pic="http://schemas.openxmlformats.org/drawingml/2006/picture">
+              <wp:extent cx="164592" cy="164592"/>
+              <wp:docPr id="44" name="Picture 44"/>
+              <wp:cNvGraphicFramePr>
+                <a:graphicFrameLocks noChangeAspect="1"/>
+              </wp:cNvGraphicFramePr>
+              <a:graphic>
+                <a:graphicData uri="http://schemas.openxmlformats.org/drawingml/2006/picture">
+                  <pic:pic>
+                    <pic:nvPicPr>
+                      <pic:cNvPr id="0" name="audio_play_icon.png"/>
+                      <pic:cNvPicPr/>
+                    </pic:nvPicPr>
+                    <pic:blipFill>
+                      <a:blip r:embed="rId17"/>
+                      <a:stretch>
+                        <a:fillRect/>
+                      </a:stretch>
+                    </pic:blipFill>
+                    <pic:spPr>
+                      <a:xfrm>
+                        <a:off x="0" y="0"/>
+                        <a:ext cx="164592" cy="164592"/>
+                      </a:xfrm>
+                      <a:prstGeom prst="rect"/>
+                    </pic:spPr>
+                  </pic:pic>
+                </a:graphicData>
+              </a:graphic>
+            </wp:inline>
+          </w:drawing>
+        </w:r>
+        <w:r>
+          <w:rPr>
+            <w:color w:val="0D47A1"/>
+            <w:u w:val="single"/>
+            <w:b/>
+            <w:sz w:val="21"/>
+          </w:rPr>
+          <w:t> [點擊播放音檔]</w:t>
+        </w:r>
+      </w:hyperlink>
     </w:p>
     <w:p>
       <w:pPr>
@@ -29566,6 +31678,54 @@
         <w:t>】</w:t>
       </w:r>
       <w:proofErr w:type="gramEnd"/>
+      <w:r>
+        <w:t xml:space="preserve">  </w:t>
+      </w:r>
+      <w:hyperlink r:id="rId55">
+        <w:r>
+          <w:drawing>
+            <wp:inline xmlns:a="http://schemas.openxmlformats.org/drawingml/2006/main" xmlns:pic="http://schemas.openxmlformats.org/drawingml/2006/picture">
+              <wp:extent cx="164592" cy="164592"/>
+              <wp:docPr id="45" name="Picture 45"/>
+              <wp:cNvGraphicFramePr>
+                <a:graphicFrameLocks noChangeAspect="1"/>
+              </wp:cNvGraphicFramePr>
+              <a:graphic>
+                <a:graphicData uri="http://schemas.openxmlformats.org/drawingml/2006/picture">
+                  <pic:pic>
+                    <pic:nvPicPr>
+                      <pic:cNvPr id="0" name="audio_play_icon.png"/>
+                      <pic:cNvPicPr/>
+                    </pic:nvPicPr>
+                    <pic:blipFill>
+                      <a:blip r:embed="rId17"/>
+                      <a:stretch>
+                        <a:fillRect/>
+                      </a:stretch>
+                    </pic:blipFill>
+                    <pic:spPr>
+                      <a:xfrm>
+                        <a:off x="0" y="0"/>
+                        <a:ext cx="164592" cy="164592"/>
+                      </a:xfrm>
+                      <a:prstGeom prst="rect"/>
+                    </pic:spPr>
+                  </pic:pic>
+                </a:graphicData>
+              </a:graphic>
+            </wp:inline>
+          </w:drawing>
+        </w:r>
+        <w:r>
+          <w:rPr>
+            <w:color w:val="0D47A1"/>
+            <w:u w:val="single"/>
+            <w:b/>
+            <w:sz w:val="21"/>
+          </w:rPr>
+          <w:t> [點擊播放音檔]</w:t>
+        </w:r>
+      </w:hyperlink>
     </w:p>
     <w:p>
       <w:pPr>
@@ -30290,6 +32450,54 @@
         <w:t>】</w:t>
       </w:r>
       <w:proofErr w:type="gramEnd"/>
+      <w:r>
+        <w:t xml:space="preserve">  </w:t>
+      </w:r>
+      <w:hyperlink r:id="rId56">
+        <w:r>
+          <w:drawing>
+            <wp:inline xmlns:a="http://schemas.openxmlformats.org/drawingml/2006/main" xmlns:pic="http://schemas.openxmlformats.org/drawingml/2006/picture">
+              <wp:extent cx="164592" cy="164592"/>
+              <wp:docPr id="46" name="Picture 46"/>
+              <wp:cNvGraphicFramePr>
+                <a:graphicFrameLocks noChangeAspect="1"/>
+              </wp:cNvGraphicFramePr>
+              <a:graphic>
+                <a:graphicData uri="http://schemas.openxmlformats.org/drawingml/2006/picture">
+                  <pic:pic>
+                    <pic:nvPicPr>
+                      <pic:cNvPr id="0" name="audio_play_icon.png"/>
+                      <pic:cNvPicPr/>
+                    </pic:nvPicPr>
+                    <pic:blipFill>
+                      <a:blip r:embed="rId17"/>
+                      <a:stretch>
+                        <a:fillRect/>
+                      </a:stretch>
+                    </pic:blipFill>
+                    <pic:spPr>
+                      <a:xfrm>
+                        <a:off x="0" y="0"/>
+                        <a:ext cx="164592" cy="164592"/>
+                      </a:xfrm>
+                      <a:prstGeom prst="rect"/>
+                    </pic:spPr>
+                  </pic:pic>
+                </a:graphicData>
+              </a:graphic>
+            </wp:inline>
+          </w:drawing>
+        </w:r>
+        <w:r>
+          <w:rPr>
+            <w:color w:val="0D47A1"/>
+            <w:u w:val="single"/>
+            <w:b/>
+            <w:sz w:val="21"/>
+          </w:rPr>
+          <w:t> [點擊播放音檔]</w:t>
+        </w:r>
+      </w:hyperlink>
     </w:p>
     <w:p>
       <w:pPr>
@@ -30521,6 +32729,54 @@
         <w:t>】</w:t>
       </w:r>
       <w:proofErr w:type="gramEnd"/>
+      <w:r>
+        <w:t xml:space="preserve">  </w:t>
+      </w:r>
+      <w:hyperlink r:id="rId50">
+        <w:r>
+          <w:drawing>
+            <wp:inline xmlns:a="http://schemas.openxmlformats.org/drawingml/2006/main" xmlns:pic="http://schemas.openxmlformats.org/drawingml/2006/picture">
+              <wp:extent cx="164592" cy="164592"/>
+              <wp:docPr id="47" name="Picture 47"/>
+              <wp:cNvGraphicFramePr>
+                <a:graphicFrameLocks noChangeAspect="1"/>
+              </wp:cNvGraphicFramePr>
+              <a:graphic>
+                <a:graphicData uri="http://schemas.openxmlformats.org/drawingml/2006/picture">
+                  <pic:pic>
+                    <pic:nvPicPr>
+                      <pic:cNvPr id="0" name="audio_play_icon.png"/>
+                      <pic:cNvPicPr/>
+                    </pic:nvPicPr>
+                    <pic:blipFill>
+                      <a:blip r:embed="rId17"/>
+                      <a:stretch>
+                        <a:fillRect/>
+                      </a:stretch>
+                    </pic:blipFill>
+                    <pic:spPr>
+                      <a:xfrm>
+                        <a:off x="0" y="0"/>
+                        <a:ext cx="164592" cy="164592"/>
+                      </a:xfrm>
+                      <a:prstGeom prst="rect"/>
+                    </pic:spPr>
+                  </pic:pic>
+                </a:graphicData>
+              </a:graphic>
+            </wp:inline>
+          </w:drawing>
+        </w:r>
+        <w:r>
+          <w:rPr>
+            <w:color w:val="0D47A1"/>
+            <w:u w:val="single"/>
+            <w:b/>
+            <w:sz w:val="21"/>
+          </w:rPr>
+          <w:t> [點擊播放音檔]</w:t>
+        </w:r>
+      </w:hyperlink>
     </w:p>
     <w:p>
       <w:pPr>
@@ -30758,6 +33014,54 @@
         <w:t>】</w:t>
       </w:r>
       <w:proofErr w:type="gramEnd"/>
+      <w:r>
+        <w:t xml:space="preserve">  </w:t>
+      </w:r>
+      <w:hyperlink r:id="rId54">
+        <w:r>
+          <w:drawing>
+            <wp:inline xmlns:a="http://schemas.openxmlformats.org/drawingml/2006/main" xmlns:pic="http://schemas.openxmlformats.org/drawingml/2006/picture">
+              <wp:extent cx="164592" cy="164592"/>
+              <wp:docPr id="48" name="Picture 48"/>
+              <wp:cNvGraphicFramePr>
+                <a:graphicFrameLocks noChangeAspect="1"/>
+              </wp:cNvGraphicFramePr>
+              <a:graphic>
+                <a:graphicData uri="http://schemas.openxmlformats.org/drawingml/2006/picture">
+                  <pic:pic>
+                    <pic:nvPicPr>
+                      <pic:cNvPr id="0" name="audio_play_icon.png"/>
+                      <pic:cNvPicPr/>
+                    </pic:nvPicPr>
+                    <pic:blipFill>
+                      <a:blip r:embed="rId17"/>
+                      <a:stretch>
+                        <a:fillRect/>
+                      </a:stretch>
+                    </pic:blipFill>
+                    <pic:spPr>
+                      <a:xfrm>
+                        <a:off x="0" y="0"/>
+                        <a:ext cx="164592" cy="164592"/>
+                      </a:xfrm>
+                      <a:prstGeom prst="rect"/>
+                    </pic:spPr>
+                  </pic:pic>
+                </a:graphicData>
+              </a:graphic>
+            </wp:inline>
+          </w:drawing>
+        </w:r>
+        <w:r>
+          <w:rPr>
+            <w:color w:val="0D47A1"/>
+            <w:u w:val="single"/>
+            <w:b/>
+            <w:sz w:val="21"/>
+          </w:rPr>
+          <w:t> [點擊播放音檔]</w:t>
+        </w:r>
+      </w:hyperlink>
     </w:p>
     <w:p>
       <w:pPr>
@@ -31124,6 +33428,54 @@
         <w:t>】</w:t>
       </w:r>
       <w:proofErr w:type="gramEnd"/>
+      <w:r>
+        <w:t xml:space="preserve">  </w:t>
+      </w:r>
+      <w:hyperlink r:id="rId55">
+        <w:r>
+          <w:drawing>
+            <wp:inline xmlns:a="http://schemas.openxmlformats.org/drawingml/2006/main" xmlns:pic="http://schemas.openxmlformats.org/drawingml/2006/picture">
+              <wp:extent cx="164592" cy="164592"/>
+              <wp:docPr id="49" name="Picture 49"/>
+              <wp:cNvGraphicFramePr>
+                <a:graphicFrameLocks noChangeAspect="1"/>
+              </wp:cNvGraphicFramePr>
+              <a:graphic>
+                <a:graphicData uri="http://schemas.openxmlformats.org/drawingml/2006/picture">
+                  <pic:pic>
+                    <pic:nvPicPr>
+                      <pic:cNvPr id="0" name="audio_play_icon.png"/>
+                      <pic:cNvPicPr/>
+                    </pic:nvPicPr>
+                    <pic:blipFill>
+                      <a:blip r:embed="rId17"/>
+                      <a:stretch>
+                        <a:fillRect/>
+                      </a:stretch>
+                    </pic:blipFill>
+                    <pic:spPr>
+                      <a:xfrm>
+                        <a:off x="0" y="0"/>
+                        <a:ext cx="164592" cy="164592"/>
+                      </a:xfrm>
+                      <a:prstGeom prst="rect"/>
+                    </pic:spPr>
+                  </pic:pic>
+                </a:graphicData>
+              </a:graphic>
+            </wp:inline>
+          </w:drawing>
+        </w:r>
+        <w:r>
+          <w:rPr>
+            <w:color w:val="0D47A1"/>
+            <w:u w:val="single"/>
+            <w:b/>
+            <w:sz w:val="21"/>
+          </w:rPr>
+          <w:t> [點擊播放音檔]</w:t>
+        </w:r>
+      </w:hyperlink>
     </w:p>
     <w:p>
       <w:pPr>
@@ -32521,6 +34873,54 @@
         <w:t>】</w:t>
       </w:r>
       <w:proofErr w:type="gramEnd"/>
+      <w:r>
+        <w:t xml:space="preserve">  </w:t>
+      </w:r>
+      <w:hyperlink r:id="rId57">
+        <w:r>
+          <w:drawing>
+            <wp:inline xmlns:a="http://schemas.openxmlformats.org/drawingml/2006/main" xmlns:pic="http://schemas.openxmlformats.org/drawingml/2006/picture">
+              <wp:extent cx="164592" cy="164592"/>
+              <wp:docPr id="50" name="Picture 50"/>
+              <wp:cNvGraphicFramePr>
+                <a:graphicFrameLocks noChangeAspect="1"/>
+              </wp:cNvGraphicFramePr>
+              <a:graphic>
+                <a:graphicData uri="http://schemas.openxmlformats.org/drawingml/2006/picture">
+                  <pic:pic>
+                    <pic:nvPicPr>
+                      <pic:cNvPr id="0" name="audio_play_icon.png"/>
+                      <pic:cNvPicPr/>
+                    </pic:nvPicPr>
+                    <pic:blipFill>
+                      <a:blip r:embed="rId17"/>
+                      <a:stretch>
+                        <a:fillRect/>
+                      </a:stretch>
+                    </pic:blipFill>
+                    <pic:spPr>
+                      <a:xfrm>
+                        <a:off x="0" y="0"/>
+                        <a:ext cx="164592" cy="164592"/>
+                      </a:xfrm>
+                      <a:prstGeom prst="rect"/>
+                    </pic:spPr>
+                  </pic:pic>
+                </a:graphicData>
+              </a:graphic>
+            </wp:inline>
+          </w:drawing>
+        </w:r>
+        <w:r>
+          <w:rPr>
+            <w:color w:val="0D47A1"/>
+            <w:u w:val="single"/>
+            <w:b/>
+            <w:sz w:val="21"/>
+          </w:rPr>
+          <w:t> [點擊播放音檔]</w:t>
+        </w:r>
+      </w:hyperlink>
     </w:p>
     <w:p>
       <w:pPr>
@@ -33700,6 +36100,54 @@
         <w:t>】</w:t>
       </w:r>
       <w:proofErr w:type="gramEnd"/>
+      <w:r>
+        <w:t xml:space="preserve">  </w:t>
+      </w:r>
+      <w:hyperlink r:id="rId58">
+        <w:r>
+          <w:drawing>
+            <wp:inline xmlns:a="http://schemas.openxmlformats.org/drawingml/2006/main" xmlns:pic="http://schemas.openxmlformats.org/drawingml/2006/picture">
+              <wp:extent cx="164592" cy="164592"/>
+              <wp:docPr id="51" name="Picture 51"/>
+              <wp:cNvGraphicFramePr>
+                <a:graphicFrameLocks noChangeAspect="1"/>
+              </wp:cNvGraphicFramePr>
+              <a:graphic>
+                <a:graphicData uri="http://schemas.openxmlformats.org/drawingml/2006/picture">
+                  <pic:pic>
+                    <pic:nvPicPr>
+                      <pic:cNvPr id="0" name="audio_play_icon.png"/>
+                      <pic:cNvPicPr/>
+                    </pic:nvPicPr>
+                    <pic:blipFill>
+                      <a:blip r:embed="rId17"/>
+                      <a:stretch>
+                        <a:fillRect/>
+                      </a:stretch>
+                    </pic:blipFill>
+                    <pic:spPr>
+                      <a:xfrm>
+                        <a:off x="0" y="0"/>
+                        <a:ext cx="164592" cy="164592"/>
+                      </a:xfrm>
+                      <a:prstGeom prst="rect"/>
+                    </pic:spPr>
+                  </pic:pic>
+                </a:graphicData>
+              </a:graphic>
+            </wp:inline>
+          </w:drawing>
+        </w:r>
+        <w:r>
+          <w:rPr>
+            <w:color w:val="0D47A1"/>
+            <w:u w:val="single"/>
+            <w:b/>
+            <w:sz w:val="21"/>
+          </w:rPr>
+          <w:t> [點擊播放音檔]</w:t>
+        </w:r>
+      </w:hyperlink>
     </w:p>
     <w:p>
       <w:pPr>
@@ -34172,6 +36620,54 @@
         <w:t>】</w:t>
       </w:r>
       <w:proofErr w:type="gramEnd"/>
+      <w:r>
+        <w:t xml:space="preserve">  </w:t>
+      </w:r>
+      <w:hyperlink r:id="rId59">
+        <w:r>
+          <w:drawing>
+            <wp:inline xmlns:a="http://schemas.openxmlformats.org/drawingml/2006/main" xmlns:pic="http://schemas.openxmlformats.org/drawingml/2006/picture">
+              <wp:extent cx="164592" cy="164592"/>
+              <wp:docPr id="52" name="Picture 52"/>
+              <wp:cNvGraphicFramePr>
+                <a:graphicFrameLocks noChangeAspect="1"/>
+              </wp:cNvGraphicFramePr>
+              <a:graphic>
+                <a:graphicData uri="http://schemas.openxmlformats.org/drawingml/2006/picture">
+                  <pic:pic>
+                    <pic:nvPicPr>
+                      <pic:cNvPr id="0" name="audio_play_icon.png"/>
+                      <pic:cNvPicPr/>
+                    </pic:nvPicPr>
+                    <pic:blipFill>
+                      <a:blip r:embed="rId17"/>
+                      <a:stretch>
+                        <a:fillRect/>
+                      </a:stretch>
+                    </pic:blipFill>
+                    <pic:spPr>
+                      <a:xfrm>
+                        <a:off x="0" y="0"/>
+                        <a:ext cx="164592" cy="164592"/>
+                      </a:xfrm>
+                      <a:prstGeom prst="rect"/>
+                    </pic:spPr>
+                  </pic:pic>
+                </a:graphicData>
+              </a:graphic>
+            </wp:inline>
+          </w:drawing>
+        </w:r>
+        <w:r>
+          <w:rPr>
+            <w:color w:val="0D47A1"/>
+            <w:u w:val="single"/>
+            <w:b/>
+            <w:sz w:val="21"/>
+          </w:rPr>
+          <w:t> [點擊播放音檔]</w:t>
+        </w:r>
+      </w:hyperlink>
     </w:p>
     <w:p>
       <w:pPr>
@@ -34519,6 +37015,54 @@
         <w:t>】</w:t>
       </w:r>
       <w:proofErr w:type="gramEnd"/>
+      <w:r>
+        <w:t xml:space="preserve">  </w:t>
+      </w:r>
+      <w:hyperlink r:id="rId60">
+        <w:r>
+          <w:drawing>
+            <wp:inline xmlns:a="http://schemas.openxmlformats.org/drawingml/2006/main" xmlns:pic="http://schemas.openxmlformats.org/drawingml/2006/picture">
+              <wp:extent cx="164592" cy="164592"/>
+              <wp:docPr id="53" name="Picture 53"/>
+              <wp:cNvGraphicFramePr>
+                <a:graphicFrameLocks noChangeAspect="1"/>
+              </wp:cNvGraphicFramePr>
+              <a:graphic>
+                <a:graphicData uri="http://schemas.openxmlformats.org/drawingml/2006/picture">
+                  <pic:pic>
+                    <pic:nvPicPr>
+                      <pic:cNvPr id="0" name="audio_play_icon.png"/>
+                      <pic:cNvPicPr/>
+                    </pic:nvPicPr>
+                    <pic:blipFill>
+                      <a:blip r:embed="rId17"/>
+                      <a:stretch>
+                        <a:fillRect/>
+                      </a:stretch>
+                    </pic:blipFill>
+                    <pic:spPr>
+                      <a:xfrm>
+                        <a:off x="0" y="0"/>
+                        <a:ext cx="164592" cy="164592"/>
+                      </a:xfrm>
+                      <a:prstGeom prst="rect"/>
+                    </pic:spPr>
+                  </pic:pic>
+                </a:graphicData>
+              </a:graphic>
+            </wp:inline>
+          </w:drawing>
+        </w:r>
+        <w:r>
+          <w:rPr>
+            <w:color w:val="0D47A1"/>
+            <w:u w:val="single"/>
+            <w:b/>
+            <w:sz w:val="21"/>
+          </w:rPr>
+          <w:t> [點擊播放音檔]</w:t>
+        </w:r>
+      </w:hyperlink>
     </w:p>
     <w:p>
       <w:pPr>
@@ -34874,6 +37418,54 @@
         <w:t>】</w:t>
       </w:r>
       <w:proofErr w:type="gramEnd"/>
+      <w:r>
+        <w:t xml:space="preserve">  </w:t>
+      </w:r>
+      <w:hyperlink r:id="rId61">
+        <w:r>
+          <w:drawing>
+            <wp:inline xmlns:a="http://schemas.openxmlformats.org/drawingml/2006/main" xmlns:pic="http://schemas.openxmlformats.org/drawingml/2006/picture">
+              <wp:extent cx="164592" cy="164592"/>
+              <wp:docPr id="54" name="Picture 54"/>
+              <wp:cNvGraphicFramePr>
+                <a:graphicFrameLocks noChangeAspect="1"/>
+              </wp:cNvGraphicFramePr>
+              <a:graphic>
+                <a:graphicData uri="http://schemas.openxmlformats.org/drawingml/2006/picture">
+                  <pic:pic>
+                    <pic:nvPicPr>
+                      <pic:cNvPr id="0" name="audio_play_icon.png"/>
+                      <pic:cNvPicPr/>
+                    </pic:nvPicPr>
+                    <pic:blipFill>
+                      <a:blip r:embed="rId17"/>
+                      <a:stretch>
+                        <a:fillRect/>
+                      </a:stretch>
+                    </pic:blipFill>
+                    <pic:spPr>
+                      <a:xfrm>
+                        <a:off x="0" y="0"/>
+                        <a:ext cx="164592" cy="164592"/>
+                      </a:xfrm>
+                      <a:prstGeom prst="rect"/>
+                    </pic:spPr>
+                  </pic:pic>
+                </a:graphicData>
+              </a:graphic>
+            </wp:inline>
+          </w:drawing>
+        </w:r>
+        <w:r>
+          <w:rPr>
+            <w:color w:val="0D47A1"/>
+            <w:u w:val="single"/>
+            <w:b/>
+            <w:sz w:val="21"/>
+          </w:rPr>
+          <w:t> [點擊播放音檔]</w:t>
+        </w:r>
+      </w:hyperlink>
     </w:p>
     <w:p>
       <w:pPr>
@@ -35579,6 +38171,54 @@
         <w:t>】</w:t>
       </w:r>
       <w:proofErr w:type="gramEnd"/>
+      <w:r>
+        <w:t xml:space="preserve">  </w:t>
+      </w:r>
+      <w:hyperlink r:id="rId62">
+        <w:r>
+          <w:drawing>
+            <wp:inline xmlns:a="http://schemas.openxmlformats.org/drawingml/2006/main" xmlns:pic="http://schemas.openxmlformats.org/drawingml/2006/picture">
+              <wp:extent cx="164592" cy="164592"/>
+              <wp:docPr id="55" name="Picture 55"/>
+              <wp:cNvGraphicFramePr>
+                <a:graphicFrameLocks noChangeAspect="1"/>
+              </wp:cNvGraphicFramePr>
+              <a:graphic>
+                <a:graphicData uri="http://schemas.openxmlformats.org/drawingml/2006/picture">
+                  <pic:pic>
+                    <pic:nvPicPr>
+                      <pic:cNvPr id="0" name="audio_play_icon.png"/>
+                      <pic:cNvPicPr/>
+                    </pic:nvPicPr>
+                    <pic:blipFill>
+                      <a:blip r:embed="rId17"/>
+                      <a:stretch>
+                        <a:fillRect/>
+                      </a:stretch>
+                    </pic:blipFill>
+                    <pic:spPr>
+                      <a:xfrm>
+                        <a:off x="0" y="0"/>
+                        <a:ext cx="164592" cy="164592"/>
+                      </a:xfrm>
+                      <a:prstGeom prst="rect"/>
+                    </pic:spPr>
+                  </pic:pic>
+                </a:graphicData>
+              </a:graphic>
+            </wp:inline>
+          </w:drawing>
+        </w:r>
+        <w:r>
+          <w:rPr>
+            <w:color w:val="0D47A1"/>
+            <w:u w:val="single"/>
+            <w:b/>
+            <w:sz w:val="21"/>
+          </w:rPr>
+          <w:t> [點擊播放音檔]</w:t>
+        </w:r>
+      </w:hyperlink>
     </w:p>
     <w:p>
       <w:pPr>
@@ -36115,6 +38755,54 @@
         <w:t>】</w:t>
       </w:r>
       <w:proofErr w:type="gramEnd"/>
+      <w:r>
+        <w:t xml:space="preserve">  </w:t>
+      </w:r>
+      <w:hyperlink r:id="rId53">
+        <w:r>
+          <w:drawing>
+            <wp:inline xmlns:a="http://schemas.openxmlformats.org/drawingml/2006/main" xmlns:pic="http://schemas.openxmlformats.org/drawingml/2006/picture">
+              <wp:extent cx="164592" cy="164592"/>
+              <wp:docPr id="56" name="Picture 56"/>
+              <wp:cNvGraphicFramePr>
+                <a:graphicFrameLocks noChangeAspect="1"/>
+              </wp:cNvGraphicFramePr>
+              <a:graphic>
+                <a:graphicData uri="http://schemas.openxmlformats.org/drawingml/2006/picture">
+                  <pic:pic>
+                    <pic:nvPicPr>
+                      <pic:cNvPr id="0" name="audio_play_icon.png"/>
+                      <pic:cNvPicPr/>
+                    </pic:nvPicPr>
+                    <pic:blipFill>
+                      <a:blip r:embed="rId17"/>
+                      <a:stretch>
+                        <a:fillRect/>
+                      </a:stretch>
+                    </pic:blipFill>
+                    <pic:spPr>
+                      <a:xfrm>
+                        <a:off x="0" y="0"/>
+                        <a:ext cx="164592" cy="164592"/>
+                      </a:xfrm>
+                      <a:prstGeom prst="rect"/>
+                    </pic:spPr>
+                  </pic:pic>
+                </a:graphicData>
+              </a:graphic>
+            </wp:inline>
+          </w:drawing>
+        </w:r>
+        <w:r>
+          <w:rPr>
+            <w:color w:val="0D47A1"/>
+            <w:u w:val="single"/>
+            <w:b/>
+            <w:sz w:val="21"/>
+          </w:rPr>
+          <w:t> [點擊播放音檔]</w:t>
+        </w:r>
+      </w:hyperlink>
     </w:p>
     <w:p>
       <w:pPr>
@@ -36420,6 +39108,54 @@
         <w:t>】</w:t>
       </w:r>
       <w:proofErr w:type="gramEnd"/>
+      <w:r>
+        <w:t xml:space="preserve">  </w:t>
+      </w:r>
+      <w:hyperlink r:id="rId53">
+        <w:r>
+          <w:drawing>
+            <wp:inline xmlns:a="http://schemas.openxmlformats.org/drawingml/2006/main" xmlns:pic="http://schemas.openxmlformats.org/drawingml/2006/picture">
+              <wp:extent cx="164592" cy="164592"/>
+              <wp:docPr id="57" name="Picture 57"/>
+              <wp:cNvGraphicFramePr>
+                <a:graphicFrameLocks noChangeAspect="1"/>
+              </wp:cNvGraphicFramePr>
+              <a:graphic>
+                <a:graphicData uri="http://schemas.openxmlformats.org/drawingml/2006/picture">
+                  <pic:pic>
+                    <pic:nvPicPr>
+                      <pic:cNvPr id="0" name="audio_play_icon.png"/>
+                      <pic:cNvPicPr/>
+                    </pic:nvPicPr>
+                    <pic:blipFill>
+                      <a:blip r:embed="rId17"/>
+                      <a:stretch>
+                        <a:fillRect/>
+                      </a:stretch>
+                    </pic:blipFill>
+                    <pic:spPr>
+                      <a:xfrm>
+                        <a:off x="0" y="0"/>
+                        <a:ext cx="164592" cy="164592"/>
+                      </a:xfrm>
+                      <a:prstGeom prst="rect"/>
+                    </pic:spPr>
+                  </pic:pic>
+                </a:graphicData>
+              </a:graphic>
+            </wp:inline>
+          </w:drawing>
+        </w:r>
+        <w:r>
+          <w:rPr>
+            <w:color w:val="0D47A1"/>
+            <w:u w:val="single"/>
+            <w:b/>
+            <w:sz w:val="21"/>
+          </w:rPr>
+          <w:t> [點擊播放音檔]</w:t>
+        </w:r>
+      </w:hyperlink>
     </w:p>
     <w:p>
       <w:pPr>
@@ -37733,6 +40469,54 @@
         <w:t>】</w:t>
       </w:r>
       <w:proofErr w:type="gramEnd"/>
+      <w:r>
+        <w:t xml:space="preserve">  </w:t>
+      </w:r>
+      <w:hyperlink r:id="rId63">
+        <w:r>
+          <w:drawing>
+            <wp:inline xmlns:a="http://schemas.openxmlformats.org/drawingml/2006/main" xmlns:pic="http://schemas.openxmlformats.org/drawingml/2006/picture">
+              <wp:extent cx="164592" cy="164592"/>
+              <wp:docPr id="58" name="Picture 58"/>
+              <wp:cNvGraphicFramePr>
+                <a:graphicFrameLocks noChangeAspect="1"/>
+              </wp:cNvGraphicFramePr>
+              <a:graphic>
+                <a:graphicData uri="http://schemas.openxmlformats.org/drawingml/2006/picture">
+                  <pic:pic>
+                    <pic:nvPicPr>
+                      <pic:cNvPr id="0" name="audio_play_icon.png"/>
+                      <pic:cNvPicPr/>
+                    </pic:nvPicPr>
+                    <pic:blipFill>
+                      <a:blip r:embed="rId17"/>
+                      <a:stretch>
+                        <a:fillRect/>
+                      </a:stretch>
+                    </pic:blipFill>
+                    <pic:spPr>
+                      <a:xfrm>
+                        <a:off x="0" y="0"/>
+                        <a:ext cx="164592" cy="164592"/>
+                      </a:xfrm>
+                      <a:prstGeom prst="rect"/>
+                    </pic:spPr>
+                  </pic:pic>
+                </a:graphicData>
+              </a:graphic>
+            </wp:inline>
+          </w:drawing>
+        </w:r>
+        <w:r>
+          <w:rPr>
+            <w:color w:val="0D47A1"/>
+            <w:u w:val="single"/>
+            <w:b/>
+            <w:sz w:val="21"/>
+          </w:rPr>
+          <w:t> [點擊播放音檔]</w:t>
+        </w:r>
+      </w:hyperlink>
     </w:p>
     <w:p>
       <w:pPr>
@@ -38263,6 +41047,54 @@
         <w:t>】</w:t>
       </w:r>
       <w:proofErr w:type="gramEnd"/>
+      <w:r>
+        <w:t xml:space="preserve">  </w:t>
+      </w:r>
+      <w:hyperlink r:id="rId64">
+        <w:r>
+          <w:drawing>
+            <wp:inline xmlns:a="http://schemas.openxmlformats.org/drawingml/2006/main" xmlns:pic="http://schemas.openxmlformats.org/drawingml/2006/picture">
+              <wp:extent cx="164592" cy="164592"/>
+              <wp:docPr id="59" name="Picture 59"/>
+              <wp:cNvGraphicFramePr>
+                <a:graphicFrameLocks noChangeAspect="1"/>
+              </wp:cNvGraphicFramePr>
+              <a:graphic>
+                <a:graphicData uri="http://schemas.openxmlformats.org/drawingml/2006/picture">
+                  <pic:pic>
+                    <pic:nvPicPr>
+                      <pic:cNvPr id="0" name="audio_play_icon.png"/>
+                      <pic:cNvPicPr/>
+                    </pic:nvPicPr>
+                    <pic:blipFill>
+                      <a:blip r:embed="rId17"/>
+                      <a:stretch>
+                        <a:fillRect/>
+                      </a:stretch>
+                    </pic:blipFill>
+                    <pic:spPr>
+                      <a:xfrm>
+                        <a:off x="0" y="0"/>
+                        <a:ext cx="164592" cy="164592"/>
+                      </a:xfrm>
+                      <a:prstGeom prst="rect"/>
+                    </pic:spPr>
+                  </pic:pic>
+                </a:graphicData>
+              </a:graphic>
+            </wp:inline>
+          </w:drawing>
+        </w:r>
+        <w:r>
+          <w:rPr>
+            <w:color w:val="0D47A1"/>
+            <w:u w:val="single"/>
+            <w:b/>
+            <w:sz w:val="21"/>
+          </w:rPr>
+          <w:t> [點擊播放音檔]</w:t>
+        </w:r>
+      </w:hyperlink>
     </w:p>
     <w:p>
       <w:pPr>
@@ -38658,6 +41490,54 @@
         <w:t>】</w:t>
       </w:r>
       <w:proofErr w:type="gramEnd"/>
+      <w:r>
+        <w:t xml:space="preserve">  </w:t>
+      </w:r>
+      <w:hyperlink r:id="rId65">
+        <w:r>
+          <w:drawing>
+            <wp:inline xmlns:a="http://schemas.openxmlformats.org/drawingml/2006/main" xmlns:pic="http://schemas.openxmlformats.org/drawingml/2006/picture">
+              <wp:extent cx="164592" cy="164592"/>
+              <wp:docPr id="60" name="Picture 60"/>
+              <wp:cNvGraphicFramePr>
+                <a:graphicFrameLocks noChangeAspect="1"/>
+              </wp:cNvGraphicFramePr>
+              <a:graphic>
+                <a:graphicData uri="http://schemas.openxmlformats.org/drawingml/2006/picture">
+                  <pic:pic>
+                    <pic:nvPicPr>
+                      <pic:cNvPr id="0" name="audio_play_icon.png"/>
+                      <pic:cNvPicPr/>
+                    </pic:nvPicPr>
+                    <pic:blipFill>
+                      <a:blip r:embed="rId17"/>
+                      <a:stretch>
+                        <a:fillRect/>
+                      </a:stretch>
+                    </pic:blipFill>
+                    <pic:spPr>
+                      <a:xfrm>
+                        <a:off x="0" y="0"/>
+                        <a:ext cx="164592" cy="164592"/>
+                      </a:xfrm>
+                      <a:prstGeom prst="rect"/>
+                    </pic:spPr>
+                  </pic:pic>
+                </a:graphicData>
+              </a:graphic>
+            </wp:inline>
+          </w:drawing>
+        </w:r>
+        <w:r>
+          <w:rPr>
+            <w:color w:val="0D47A1"/>
+            <w:u w:val="single"/>
+            <w:b/>
+            <w:sz w:val="21"/>
+          </w:rPr>
+          <w:t> [點擊播放音檔]</w:t>
+        </w:r>
+      </w:hyperlink>
     </w:p>
     <w:p>
       <w:pPr>
@@ -39039,6 +41919,54 @@
         <w:t>】</w:t>
       </w:r>
       <w:proofErr w:type="gramEnd"/>
+      <w:r>
+        <w:t xml:space="preserve">  </w:t>
+      </w:r>
+      <w:hyperlink r:id="rId66">
+        <w:r>
+          <w:drawing>
+            <wp:inline xmlns:a="http://schemas.openxmlformats.org/drawingml/2006/main" xmlns:pic="http://schemas.openxmlformats.org/drawingml/2006/picture">
+              <wp:extent cx="164592" cy="164592"/>
+              <wp:docPr id="61" name="Picture 61"/>
+              <wp:cNvGraphicFramePr>
+                <a:graphicFrameLocks noChangeAspect="1"/>
+              </wp:cNvGraphicFramePr>
+              <a:graphic>
+                <a:graphicData uri="http://schemas.openxmlformats.org/drawingml/2006/picture">
+                  <pic:pic>
+                    <pic:nvPicPr>
+                      <pic:cNvPr id="0" name="audio_play_icon.png"/>
+                      <pic:cNvPicPr/>
+                    </pic:nvPicPr>
+                    <pic:blipFill>
+                      <a:blip r:embed="rId17"/>
+                      <a:stretch>
+                        <a:fillRect/>
+                      </a:stretch>
+                    </pic:blipFill>
+                    <pic:spPr>
+                      <a:xfrm>
+                        <a:off x="0" y="0"/>
+                        <a:ext cx="164592" cy="164592"/>
+                      </a:xfrm>
+                      <a:prstGeom prst="rect"/>
+                    </pic:spPr>
+                  </pic:pic>
+                </a:graphicData>
+              </a:graphic>
+            </wp:inline>
+          </w:drawing>
+        </w:r>
+        <w:r>
+          <w:rPr>
+            <w:color w:val="0D47A1"/>
+            <w:u w:val="single"/>
+            <w:b/>
+            <w:sz w:val="21"/>
+          </w:rPr>
+          <w:t> [點擊播放音檔]</w:t>
+        </w:r>
+      </w:hyperlink>
     </w:p>
     <w:p>
       <w:pPr>

</xml_diff>